<commit_message>
docs(testing): UC1-01 UC1-02 UC1-03 add basis-path tests for registration, login redirect and profile policy
</commit_message>
<xml_diff>
--- a/docs/testing/account-testing/account-testing-report.docx
+++ b/docs/testing/account-testing/account-testing-report.docx
@@ -34,7 +34,7 @@
         <w:rPr>
           <w:b/>
         </w:rPr>
-        <w:t>The focused automated checks passed 201 tests across 12 files, with 2 recorded as todo and none failed. 50 of them are the Lab 4 cases in this report, each with recorded expected and actual output. The 35 browser scenarios are prepared for execution and are explicitly marked Not run.</w:t>
+        <w:t>The focused automated checks passed 226 tests across 13 files, with 2 recorded as todo and none failed. 75 of them are the Lab 4 cases in this report, each with recorded expected and actual output. The 35 browser scenarios are prepared for execution and are explicitly marked Not run.</w:t>
       </w:r>
     </w:p>
     <w:tbl>
@@ -290,7 +290,7 @@
                 <w:color w:val="000000"/>
                 <w:sz w:val="20"/>
               </w:rPr>
-              <w:t>-</w:t>
+              <w:t>registerUser server action (7 paths)</w:t>
             </w:r>
           </w:p>
         </w:tc>
@@ -408,7 +408,7 @@
                 <w:color w:val="000000"/>
                 <w:sz w:val="20"/>
               </w:rPr>
-              <w:t>-</w:t>
+              <w:t>safeRedirectPath after login (8 paths)</w:t>
             </w:r>
           </w:p>
         </w:tc>
@@ -526,7 +526,7 @@
                 <w:color w:val="000000"/>
                 <w:sz w:val="20"/>
               </w:rPr>
-              <w:t>-</w:t>
+              <w:t>prepareProfileUpdate policy (10 paths)</w:t>
             </w:r>
           </w:p>
         </w:tc>
@@ -797,7 +797,7 @@
           <w:b w:val="0"/>
           <w:sz w:val="18"/>
         </w:rPr>
-        <w:t>Implementation baseline: 7aacdc97e2ab7d72724429b13eb7f17ee398010b (main, 20 October 2026). UC1-04 deleteAccount is the control class chosen for black-box testing, as required by Lab 4 section 3.2.1; UC1-03 UpdateProfile is a second executed table.</w:t>
+        <w:t>Implementation baseline: 7aacdc97e2ab7d72724429b13eb7f17ee398010b (main, 20 October 2026). UC1-04 deleteAccount is the control class chosen for black-box testing, as required by Lab 4 section 3.2.1; UC1-03 UpdateProfile is a second executed table. Lab 4 section 3.2.2 asks for basis paths of two methods; this report covers one method for each use case (five in total).</w:t>
       </w:r>
     </w:p>
     <w:p>
@@ -17359,6 +17359,3802 @@
         <w:pStyle w:val="Heading1"/>
       </w:pPr>
       <w:r>
+        <w:t>White box testing UC1-01</w:t>
+      </w:r>
+    </w:p>
+    <w:p>
+      <w:pPr>
+        <w:pStyle w:val="Heading2"/>
+      </w:pPr>
+      <w:r>
+        <w:t>registerUser: sign-up outcomes</w:t>
+      </w:r>
+    </w:p>
+    <w:p>
+      <w:r>
+        <w:rPr>
+          <w:b w:val="0"/>
+          <w:sz w:val="18"/>
+        </w:rPr>
+        <w:t>Source: app/(auth)/register/actions.ts:23-97</w:t>
+      </w:r>
+    </w:p>
+    <w:p>
+      <w:r>
+        <w:rPr>
+          <w:b w:val="0"/>
+          <w:sz w:val="19"/>
+        </w:rPr>
+        <w:t>Graph one call of the registerUser server action with Supabase and the request headers replaced by test doubles. Field validation and the confirmation link are one decision each; "hidden duplicate" (no error, user returned with no identities) is one compound decision because Supabase reports it as one case.</w:t>
+      </w:r>
+    </w:p>
+    <w:p>
+      <w:pPr>
+        <w:jc w:val="center"/>
+      </w:pPr>
+      <w:r>
+        <w:drawing>
+          <wp:inline xmlns:a="http://schemas.openxmlformats.org/drawingml/2006/main" xmlns:pic="http://schemas.openxmlformats.org/drawingml/2006/picture">
+            <wp:extent cx="9235440" cy="1523162"/>
+            <wp:docPr id="1" name="Picture 1" descr="register user cfg control flow graph"/>
+            <wp:cNvGraphicFramePr>
+              <a:graphicFrameLocks noChangeAspect="1"/>
+            </wp:cNvGraphicFramePr>
+            <a:graphic>
+              <a:graphicData uri="http://schemas.openxmlformats.org/drawingml/2006/picture">
+                <pic:pic>
+                  <pic:nvPicPr>
+                    <pic:cNvPr id="0" name="register-user-cfg.png"/>
+                    <pic:cNvPicPr/>
+                  </pic:nvPicPr>
+                  <pic:blipFill>
+                    <a:blip r:embed="rId10"/>
+                    <a:stretch>
+                      <a:fillRect/>
+                    </a:stretch>
+                  </pic:blipFill>
+                  <pic:spPr>
+                    <a:xfrm>
+                      <a:off x="0" y="0"/>
+                      <a:ext cx="9235440" cy="1523162"/>
+                    </a:xfrm>
+                    <a:prstGeom prst="rect"/>
+                  </pic:spPr>
+                </pic:pic>
+              </a:graphicData>
+            </a:graphic>
+          </wp:inline>
+        </w:drawing>
+      </w:r>
+    </w:p>
+    <w:p>
+      <w:r>
+        <w:rPr>
+          <w:b/>
+          <w:sz w:val="20"/>
+        </w:rPr>
+        <w:t>Cyclomatic complexity V(G) = 20 - 15 + 2 = 7. Six decisions (G1, G3, G6, G7, G9, G11) also give 6 + 1 = 7.</w:t>
+      </w:r>
+    </w:p>
+    <w:p>
+      <w:r>
+        <w:br w:type="page"/>
+      </w:r>
+    </w:p>
+    <w:p>
+      <w:pPr>
+        <w:pStyle w:val="Heading1"/>
+      </w:pPr>
+      <w:r>
+        <w:t>Basis paths for UC1-01</w:t>
+      </w:r>
+    </w:p>
+    <w:p>
+      <w:r>
+        <w:rPr>
+          <w:b/>
+          <w:sz w:val="22"/>
+        </w:rPr>
+        <w:t>registerUser: sign-up outcomes</w:t>
+      </w:r>
+    </w:p>
+    <w:tbl>
+      <w:tblPr>
+        <w:tblW w:type="auto" w:w="0"/>
+        <w:jc w:val="center"/>
+        <w:tblBorders>
+          <w:top w:val="single" w:sz="4" w:color="D9D9D9"/>
+          <w:left w:val="single" w:sz="4" w:color="D9D9D9"/>
+          <w:bottom w:val="single" w:sz="4" w:color="D9D9D9"/>
+          <w:right w:val="single" w:sz="4" w:color="D9D9D9"/>
+          <w:insideH w:val="single" w:sz="4" w:color="D9D9D9"/>
+          <w:insideV w:val="single" w:sz="4" w:color="D9D9D9"/>
+        </w:tblBorders>
+        <w:tblLayout w:type="fixed"/>
+        <w:tblLook w:firstColumn="1" w:firstRow="1" w:lastColumn="0" w:lastRow="0" w:noHBand="0" w:noVBand="1" w:val="04A0"/>
+      </w:tblPr>
+      <w:tblGrid>
+        <w:gridCol w:w="792"/>
+        <w:gridCol w:w="3744"/>
+        <w:gridCol w:w="6336"/>
+        <w:gridCol w:w="4219"/>
+      </w:tblGrid>
+      <w:tr>
+        <w:trPr>
+          <w:cantSplit/>
+          <w:tblHeader/>
+        </w:trPr>
+        <w:tc>
+          <w:tcPr>
+            <w:tcW w:type="dxa" w:w="792"/>
+            <w:shd w:val="clear" w:fill="E7E7E7"/>
+            <w:tcMar>
+              <w:top w:w="75" w:type="dxa"/>
+              <w:left w:w="75" w:type="dxa"/>
+              <w:bottom w:w="75" w:type="dxa"/>
+              <w:right w:w="75" w:type="dxa"/>
+            </w:tcMar>
+            <w:vAlign w:val="center"/>
+          </w:tcPr>
+          <w:p>
+            <w:pPr>
+              <w:keepNext/>
+              <w:spacing w:after="0" w:line="250" w:lineRule="auto"/>
+              <w:jc w:val="center"/>
+            </w:pPr>
+            <w:r>
+              <w:rPr>
+                <w:rFonts w:ascii="Arial" w:hAnsi="Arial"/>
+                <w:b/>
+                <w:color w:val="000000"/>
+                <w:sz w:val="18"/>
+              </w:rPr>
+              <w:t>Path</w:t>
+            </w:r>
+          </w:p>
+        </w:tc>
+        <w:tc>
+          <w:tcPr>
+            <w:tcW w:type="dxa" w:w="3744"/>
+            <w:shd w:val="clear" w:fill="E7E7E7"/>
+            <w:tcMar>
+              <w:top w:w="75" w:type="dxa"/>
+              <w:left w:w="75" w:type="dxa"/>
+              <w:bottom w:w="75" w:type="dxa"/>
+              <w:right w:w="75" w:type="dxa"/>
+            </w:tcMar>
+            <w:vAlign w:val="center"/>
+          </w:tcPr>
+          <w:p>
+            <w:pPr>
+              <w:keepNext/>
+              <w:spacing w:after="0" w:line="250" w:lineRule="auto"/>
+            </w:pPr>
+            <w:r>
+              <w:rPr>
+                <w:rFonts w:ascii="Arial" w:hAnsi="Arial"/>
+                <w:b/>
+                <w:color w:val="000000"/>
+                <w:sz w:val="18"/>
+              </w:rPr>
+              <w:t>Basis set of nodes</w:t>
+            </w:r>
+          </w:p>
+        </w:tc>
+        <w:tc>
+          <w:tcPr>
+            <w:tcW w:type="dxa" w:w="6336"/>
+            <w:shd w:val="clear" w:fill="E7E7E7"/>
+            <w:tcMar>
+              <w:top w:w="75" w:type="dxa"/>
+              <w:left w:w="75" w:type="dxa"/>
+              <w:bottom w:w="75" w:type="dxa"/>
+              <w:right w:w="75" w:type="dxa"/>
+            </w:tcMar>
+            <w:vAlign w:val="center"/>
+          </w:tcPr>
+          <w:p>
+            <w:pPr>
+              <w:keepNext/>
+              <w:spacing w:after="0" w:line="250" w:lineRule="auto"/>
+            </w:pPr>
+            <w:r>
+              <w:rPr>
+                <w:rFonts w:ascii="Arial" w:hAnsi="Arial"/>
+                <w:b/>
+                <w:color w:val="000000"/>
+                <w:sz w:val="18"/>
+              </w:rPr>
+              <w:t>Input and expected output</w:t>
+            </w:r>
+          </w:p>
+        </w:tc>
+        <w:tc>
+          <w:tcPr>
+            <w:tcW w:type="dxa" w:w="4219"/>
+            <w:shd w:val="clear" w:fill="E7E7E7"/>
+            <w:tcMar>
+              <w:top w:w="75" w:type="dxa"/>
+              <w:left w:w="75" w:type="dxa"/>
+              <w:bottom w:w="75" w:type="dxa"/>
+              <w:right w:w="75" w:type="dxa"/>
+            </w:tcMar>
+            <w:vAlign w:val="center"/>
+          </w:tcPr>
+          <w:p>
+            <w:pPr>
+              <w:keepNext/>
+              <w:spacing w:after="0" w:line="250" w:lineRule="auto"/>
+            </w:pPr>
+            <w:r>
+              <w:rPr>
+                <w:rFonts w:ascii="Arial" w:hAnsi="Arial"/>
+                <w:b/>
+                <w:color w:val="000000"/>
+                <w:sz w:val="18"/>
+              </w:rPr>
+              <w:t>Execution evidence</w:t>
+            </w:r>
+          </w:p>
+        </w:tc>
+      </w:tr>
+      <w:tr>
+        <w:trPr>
+          <w:cantSplit/>
+        </w:trPr>
+        <w:tc>
+          <w:tcPr>
+            <w:tcW w:type="dxa" w:w="792"/>
+            <w:shd w:val="clear" w:fill="FFFFFF"/>
+            <w:tcMar>
+              <w:top w:w="75" w:type="dxa"/>
+              <w:left w:w="75" w:type="dxa"/>
+              <w:bottom w:w="75" w:type="dxa"/>
+              <w:right w:w="75" w:type="dxa"/>
+            </w:tcMar>
+            <w:vAlign w:val="center"/>
+          </w:tcPr>
+          <w:p>
+            <w:pPr>
+              <w:keepNext w:val="0"/>
+              <w:spacing w:after="0" w:line="250" w:lineRule="auto"/>
+              <w:jc w:val="center"/>
+            </w:pPr>
+            <w:r>
+              <w:rPr>
+                <w:rFonts w:ascii="Arial" w:hAnsi="Arial"/>
+                <w:b w:val="0"/>
+                <w:color w:val="000000"/>
+                <w:sz w:val="18"/>
+              </w:rPr>
+              <w:t>G1</w:t>
+            </w:r>
+          </w:p>
+        </w:tc>
+        <w:tc>
+          <w:tcPr>
+            <w:tcW w:type="dxa" w:w="3744"/>
+            <w:shd w:val="clear" w:fill="FFFFFF"/>
+            <w:tcMar>
+              <w:top w:w="75" w:type="dxa"/>
+              <w:left w:w="75" w:type="dxa"/>
+              <w:bottom w:w="75" w:type="dxa"/>
+              <w:right w:w="75" w:type="dxa"/>
+            </w:tcMar>
+            <w:vAlign w:val="center"/>
+          </w:tcPr>
+          <w:p>
+            <w:pPr>
+              <w:keepNext w:val="0"/>
+              <w:spacing w:after="0" w:line="250" w:lineRule="auto"/>
+            </w:pPr>
+            <w:r>
+              <w:rPr>
+                <w:rFonts w:ascii="Arial" w:hAnsi="Arial"/>
+                <w:b w:val="0"/>
+                <w:color w:val="000000"/>
+                <w:sz w:val="18"/>
+              </w:rPr>
+              <w:t>G0 G1 G2 G14</w:t>
+            </w:r>
+          </w:p>
+        </w:tc>
+        <w:tc>
+          <w:tcPr>
+            <w:tcW w:type="dxa" w:w="6336"/>
+            <w:shd w:val="clear" w:fill="FFFFFF"/>
+            <w:tcMar>
+              <w:top w:w="75" w:type="dxa"/>
+              <w:left w:w="75" w:type="dxa"/>
+              <w:bottom w:w="75" w:type="dxa"/>
+              <w:right w:w="75" w:type="dxa"/>
+            </w:tcMar>
+            <w:vAlign w:val="center"/>
+          </w:tcPr>
+          <w:p>
+            <w:pPr>
+              <w:keepNext w:val="0"/>
+              <w:spacing w:after="0" w:line="250" w:lineRule="auto"/>
+            </w:pPr>
+            <w:r>
+              <w:rPr>
+                <w:rFonts w:ascii="Arial" w:hAnsi="Arial"/>
+                <w:b w:val="0"/>
+                <w:color w:val="000000"/>
+                <w:sz w:val="18"/>
+              </w:rPr>
+              <w:t>Password of 5 characters. "Please fix the highlighted fields."; sign-up not called.</w:t>
+            </w:r>
+          </w:p>
+        </w:tc>
+        <w:tc>
+          <w:tcPr>
+            <w:tcW w:type="dxa" w:w="4219"/>
+            <w:shd w:val="clear" w:fill="FFFFFF"/>
+            <w:tcMar>
+              <w:top w:w="75" w:type="dxa"/>
+              <w:left w:w="75" w:type="dxa"/>
+              <w:bottom w:w="75" w:type="dxa"/>
+              <w:right w:w="75" w:type="dxa"/>
+            </w:tcMar>
+            <w:vAlign w:val="center"/>
+          </w:tcPr>
+          <w:p>
+            <w:pPr>
+              <w:keepNext w:val="0"/>
+              <w:spacing w:after="0" w:line="250" w:lineRule="auto"/>
+            </w:pPr>
+            <w:r>
+              <w:rPr>
+                <w:rFonts w:ascii="Arial" w:hAnsi="Arial"/>
+                <w:b w:val="0"/>
+                <w:color w:val="000000"/>
+                <w:sz w:val="18"/>
+              </w:rPr>
+              <w:t>Pass; WB-G1 actual equals expected.</w:t>
+            </w:r>
+          </w:p>
+        </w:tc>
+      </w:tr>
+      <w:tr>
+        <w:trPr>
+          <w:cantSplit/>
+        </w:trPr>
+        <w:tc>
+          <w:tcPr>
+            <w:tcW w:type="dxa" w:w="792"/>
+            <w:shd w:val="clear" w:fill="FFFFFF"/>
+            <w:tcMar>
+              <w:top w:w="75" w:type="dxa"/>
+              <w:left w:w="75" w:type="dxa"/>
+              <w:bottom w:w="75" w:type="dxa"/>
+              <w:right w:w="75" w:type="dxa"/>
+            </w:tcMar>
+            <w:vAlign w:val="center"/>
+          </w:tcPr>
+          <w:p>
+            <w:pPr>
+              <w:keepNext w:val="0"/>
+              <w:spacing w:after="0" w:line="250" w:lineRule="auto"/>
+              <w:jc w:val="center"/>
+            </w:pPr>
+            <w:r>
+              <w:rPr>
+                <w:rFonts w:ascii="Arial" w:hAnsi="Arial"/>
+                <w:b w:val="0"/>
+                <w:color w:val="000000"/>
+                <w:sz w:val="18"/>
+              </w:rPr>
+              <w:t>G2</w:t>
+            </w:r>
+          </w:p>
+        </w:tc>
+        <w:tc>
+          <w:tcPr>
+            <w:tcW w:type="dxa" w:w="3744"/>
+            <w:shd w:val="clear" w:fill="FFFFFF"/>
+            <w:tcMar>
+              <w:top w:w="75" w:type="dxa"/>
+              <w:left w:w="75" w:type="dxa"/>
+              <w:bottom w:w="75" w:type="dxa"/>
+              <w:right w:w="75" w:type="dxa"/>
+            </w:tcMar>
+            <w:vAlign w:val="center"/>
+          </w:tcPr>
+          <w:p>
+            <w:pPr>
+              <w:keepNext w:val="0"/>
+              <w:spacing w:after="0" w:line="250" w:lineRule="auto"/>
+            </w:pPr>
+            <w:r>
+              <w:rPr>
+                <w:rFonts w:ascii="Arial" w:hAnsi="Arial"/>
+                <w:b w:val="0"/>
+                <w:color w:val="000000"/>
+                <w:sz w:val="18"/>
+              </w:rPr>
+              <w:t>G0 G1 G3 G4 G14</w:t>
+            </w:r>
+          </w:p>
+        </w:tc>
+        <w:tc>
+          <w:tcPr>
+            <w:tcW w:type="dxa" w:w="6336"/>
+            <w:shd w:val="clear" w:fill="FFFFFF"/>
+            <w:tcMar>
+              <w:top w:w="75" w:type="dxa"/>
+              <w:left w:w="75" w:type="dxa"/>
+              <w:bottom w:w="75" w:type="dxa"/>
+              <w:right w:w="75" w:type="dxa"/>
+            </w:tcMar>
+            <w:vAlign w:val="center"/>
+          </w:tcPr>
+          <w:p>
+            <w:pPr>
+              <w:keepNext w:val="0"/>
+              <w:spacing w:after="0" w:line="250" w:lineRule="auto"/>
+            </w:pPr>
+            <w:r>
+              <w:rPr>
+                <w:rFonts w:ascii="Arial" w:hAnsi="Arial"/>
+                <w:b w:val="0"/>
+                <w:color w:val="000000"/>
+                <w:sz w:val="18"/>
+              </w:rPr>
+              <w:t>Valid fields; no Origin header. Confirmation-link error; sign-up not called.</w:t>
+            </w:r>
+          </w:p>
+        </w:tc>
+        <w:tc>
+          <w:tcPr>
+            <w:tcW w:type="dxa" w:w="4219"/>
+            <w:shd w:val="clear" w:fill="FFFFFF"/>
+            <w:tcMar>
+              <w:top w:w="75" w:type="dxa"/>
+              <w:left w:w="75" w:type="dxa"/>
+              <w:bottom w:w="75" w:type="dxa"/>
+              <w:right w:w="75" w:type="dxa"/>
+            </w:tcMar>
+            <w:vAlign w:val="center"/>
+          </w:tcPr>
+          <w:p>
+            <w:pPr>
+              <w:keepNext w:val="0"/>
+              <w:spacing w:after="0" w:line="250" w:lineRule="auto"/>
+            </w:pPr>
+            <w:r>
+              <w:rPr>
+                <w:rFonts w:ascii="Arial" w:hAnsi="Arial"/>
+                <w:b w:val="0"/>
+                <w:color w:val="000000"/>
+                <w:sz w:val="18"/>
+              </w:rPr>
+              <w:t>Pass; WB-G2 actual equals expected.</w:t>
+            </w:r>
+          </w:p>
+        </w:tc>
+      </w:tr>
+      <w:tr>
+        <w:trPr>
+          <w:cantSplit/>
+        </w:trPr>
+        <w:tc>
+          <w:tcPr>
+            <w:tcW w:type="dxa" w:w="792"/>
+            <w:shd w:val="clear" w:fill="FFFFFF"/>
+            <w:tcMar>
+              <w:top w:w="75" w:type="dxa"/>
+              <w:left w:w="75" w:type="dxa"/>
+              <w:bottom w:w="75" w:type="dxa"/>
+              <w:right w:w="75" w:type="dxa"/>
+            </w:tcMar>
+            <w:vAlign w:val="center"/>
+          </w:tcPr>
+          <w:p>
+            <w:pPr>
+              <w:keepNext w:val="0"/>
+              <w:spacing w:after="0" w:line="250" w:lineRule="auto"/>
+              <w:jc w:val="center"/>
+            </w:pPr>
+            <w:r>
+              <w:rPr>
+                <w:rFonts w:ascii="Arial" w:hAnsi="Arial"/>
+                <w:b w:val="0"/>
+                <w:color w:val="000000"/>
+                <w:sz w:val="18"/>
+              </w:rPr>
+              <w:t>G3</w:t>
+            </w:r>
+          </w:p>
+        </w:tc>
+        <w:tc>
+          <w:tcPr>
+            <w:tcW w:type="dxa" w:w="3744"/>
+            <w:shd w:val="clear" w:fill="FFFFFF"/>
+            <w:tcMar>
+              <w:top w:w="75" w:type="dxa"/>
+              <w:left w:w="75" w:type="dxa"/>
+              <w:bottom w:w="75" w:type="dxa"/>
+              <w:right w:w="75" w:type="dxa"/>
+            </w:tcMar>
+            <w:vAlign w:val="center"/>
+          </w:tcPr>
+          <w:p>
+            <w:pPr>
+              <w:keepNext w:val="0"/>
+              <w:spacing w:after="0" w:line="250" w:lineRule="auto"/>
+            </w:pPr>
+            <w:r>
+              <w:rPr>
+                <w:rFonts w:ascii="Arial" w:hAnsi="Arial"/>
+                <w:b w:val="0"/>
+                <w:color w:val="000000"/>
+                <w:sz w:val="18"/>
+              </w:rPr>
+              <w:t>G0 G1 G3 G5 G6 G8 G14</w:t>
+            </w:r>
+          </w:p>
+        </w:tc>
+        <w:tc>
+          <w:tcPr>
+            <w:tcW w:type="dxa" w:w="6336"/>
+            <w:shd w:val="clear" w:fill="FFFFFF"/>
+            <w:tcMar>
+              <w:top w:w="75" w:type="dxa"/>
+              <w:left w:w="75" w:type="dxa"/>
+              <w:bottom w:w="75" w:type="dxa"/>
+              <w:right w:w="75" w:type="dxa"/>
+            </w:tcMar>
+            <w:vAlign w:val="center"/>
+          </w:tcPr>
+          <w:p>
+            <w:pPr>
+              <w:keepNext w:val="0"/>
+              <w:spacing w:after="0" w:line="250" w:lineRule="auto"/>
+            </w:pPr>
+            <w:r>
+              <w:rPr>
+                <w:rFonts w:ascii="Arial" w:hAnsi="Arial"/>
+                <w:b w:val="0"/>
+                <w:color w:val="000000"/>
+                <w:sz w:val="18"/>
+              </w:rPr>
+              <w:t>Sign-up error user_already_exists. "An account with this email already exists."; emailTaken.</w:t>
+            </w:r>
+          </w:p>
+        </w:tc>
+        <w:tc>
+          <w:tcPr>
+            <w:tcW w:type="dxa" w:w="4219"/>
+            <w:shd w:val="clear" w:fill="FFFFFF"/>
+            <w:tcMar>
+              <w:top w:w="75" w:type="dxa"/>
+              <w:left w:w="75" w:type="dxa"/>
+              <w:bottom w:w="75" w:type="dxa"/>
+              <w:right w:w="75" w:type="dxa"/>
+            </w:tcMar>
+            <w:vAlign w:val="center"/>
+          </w:tcPr>
+          <w:p>
+            <w:pPr>
+              <w:keepNext w:val="0"/>
+              <w:spacing w:after="0" w:line="250" w:lineRule="auto"/>
+            </w:pPr>
+            <w:r>
+              <w:rPr>
+                <w:rFonts w:ascii="Arial" w:hAnsi="Arial"/>
+                <w:b w:val="0"/>
+                <w:color w:val="000000"/>
+                <w:sz w:val="18"/>
+              </w:rPr>
+              <w:t>Pass; WB-G3 actual equals expected.</w:t>
+            </w:r>
+          </w:p>
+        </w:tc>
+      </w:tr>
+      <w:tr>
+        <w:trPr>
+          <w:cantSplit/>
+        </w:trPr>
+        <w:tc>
+          <w:tcPr>
+            <w:tcW w:type="dxa" w:w="792"/>
+            <w:shd w:val="clear" w:fill="FFFFFF"/>
+            <w:tcMar>
+              <w:top w:w="75" w:type="dxa"/>
+              <w:left w:w="75" w:type="dxa"/>
+              <w:bottom w:w="75" w:type="dxa"/>
+              <w:right w:w="75" w:type="dxa"/>
+            </w:tcMar>
+            <w:vAlign w:val="center"/>
+          </w:tcPr>
+          <w:p>
+            <w:pPr>
+              <w:keepNext w:val="0"/>
+              <w:spacing w:after="0" w:line="250" w:lineRule="auto"/>
+              <w:jc w:val="center"/>
+            </w:pPr>
+            <w:r>
+              <w:rPr>
+                <w:rFonts w:ascii="Arial" w:hAnsi="Arial"/>
+                <w:b w:val="0"/>
+                <w:color w:val="000000"/>
+                <w:sz w:val="18"/>
+              </w:rPr>
+              <w:t>G4</w:t>
+            </w:r>
+          </w:p>
+        </w:tc>
+        <w:tc>
+          <w:tcPr>
+            <w:tcW w:type="dxa" w:w="3744"/>
+            <w:shd w:val="clear" w:fill="FFFFFF"/>
+            <w:tcMar>
+              <w:top w:w="75" w:type="dxa"/>
+              <w:left w:w="75" w:type="dxa"/>
+              <w:bottom w:w="75" w:type="dxa"/>
+              <w:right w:w="75" w:type="dxa"/>
+            </w:tcMar>
+            <w:vAlign w:val="center"/>
+          </w:tcPr>
+          <w:p>
+            <w:pPr>
+              <w:keepNext w:val="0"/>
+              <w:spacing w:after="0" w:line="250" w:lineRule="auto"/>
+            </w:pPr>
+            <w:r>
+              <w:rPr>
+                <w:rFonts w:ascii="Arial" w:hAnsi="Arial"/>
+                <w:b w:val="0"/>
+                <w:color w:val="000000"/>
+                <w:sz w:val="18"/>
+              </w:rPr>
+              <w:t>G0 G1 G3 G5 G6 G7 G8 G14</w:t>
+            </w:r>
+          </w:p>
+        </w:tc>
+        <w:tc>
+          <w:tcPr>
+            <w:tcW w:type="dxa" w:w="6336"/>
+            <w:shd w:val="clear" w:fill="FFFFFF"/>
+            <w:tcMar>
+              <w:top w:w="75" w:type="dxa"/>
+              <w:left w:w="75" w:type="dxa"/>
+              <w:bottom w:w="75" w:type="dxa"/>
+              <w:right w:w="75" w:type="dxa"/>
+            </w:tcMar>
+            <w:vAlign w:val="center"/>
+          </w:tcPr>
+          <w:p>
+            <w:pPr>
+              <w:keepNext w:val="0"/>
+              <w:spacing w:after="0" w:line="250" w:lineRule="auto"/>
+            </w:pPr>
+            <w:r>
+              <w:rPr>
+                <w:rFonts w:ascii="Arial" w:hAnsi="Arial"/>
+                <w:b w:val="0"/>
+                <w:color w:val="000000"/>
+                <w:sz w:val="18"/>
+              </w:rPr>
+              <w:t>No error; user with no identities. Same duplicate message; emailTaken.</w:t>
+            </w:r>
+          </w:p>
+        </w:tc>
+        <w:tc>
+          <w:tcPr>
+            <w:tcW w:type="dxa" w:w="4219"/>
+            <w:shd w:val="clear" w:fill="FFFFFF"/>
+            <w:tcMar>
+              <w:top w:w="75" w:type="dxa"/>
+              <w:left w:w="75" w:type="dxa"/>
+              <w:bottom w:w="75" w:type="dxa"/>
+              <w:right w:w="75" w:type="dxa"/>
+            </w:tcMar>
+            <w:vAlign w:val="center"/>
+          </w:tcPr>
+          <w:p>
+            <w:pPr>
+              <w:keepNext w:val="0"/>
+              <w:spacing w:after="0" w:line="250" w:lineRule="auto"/>
+            </w:pPr>
+            <w:r>
+              <w:rPr>
+                <w:rFonts w:ascii="Arial" w:hAnsi="Arial"/>
+                <w:b w:val="0"/>
+                <w:color w:val="000000"/>
+                <w:sz w:val="18"/>
+              </w:rPr>
+              <w:t>Pass; WB-G4 actual equals expected.</w:t>
+            </w:r>
+          </w:p>
+        </w:tc>
+      </w:tr>
+      <w:tr>
+        <w:trPr>
+          <w:cantSplit/>
+        </w:trPr>
+        <w:tc>
+          <w:tcPr>
+            <w:tcW w:type="dxa" w:w="792"/>
+            <w:shd w:val="clear" w:fill="FFFFFF"/>
+            <w:tcMar>
+              <w:top w:w="75" w:type="dxa"/>
+              <w:left w:w="75" w:type="dxa"/>
+              <w:bottom w:w="75" w:type="dxa"/>
+              <w:right w:w="75" w:type="dxa"/>
+            </w:tcMar>
+            <w:vAlign w:val="center"/>
+          </w:tcPr>
+          <w:p>
+            <w:pPr>
+              <w:keepNext w:val="0"/>
+              <w:spacing w:after="0" w:line="250" w:lineRule="auto"/>
+              <w:jc w:val="center"/>
+            </w:pPr>
+            <w:r>
+              <w:rPr>
+                <w:rFonts w:ascii="Arial" w:hAnsi="Arial"/>
+                <w:b w:val="0"/>
+                <w:color w:val="000000"/>
+                <w:sz w:val="18"/>
+              </w:rPr>
+              <w:t>G5</w:t>
+            </w:r>
+          </w:p>
+        </w:tc>
+        <w:tc>
+          <w:tcPr>
+            <w:tcW w:type="dxa" w:w="3744"/>
+            <w:shd w:val="clear" w:fill="FFFFFF"/>
+            <w:tcMar>
+              <w:top w:w="75" w:type="dxa"/>
+              <w:left w:w="75" w:type="dxa"/>
+              <w:bottom w:w="75" w:type="dxa"/>
+              <w:right w:w="75" w:type="dxa"/>
+            </w:tcMar>
+            <w:vAlign w:val="center"/>
+          </w:tcPr>
+          <w:p>
+            <w:pPr>
+              <w:keepNext w:val="0"/>
+              <w:spacing w:after="0" w:line="250" w:lineRule="auto"/>
+            </w:pPr>
+            <w:r>
+              <w:rPr>
+                <w:rFonts w:ascii="Arial" w:hAnsi="Arial"/>
+                <w:b w:val="0"/>
+                <w:color w:val="000000"/>
+                <w:sz w:val="18"/>
+              </w:rPr>
+              <w:t>G0 G1 G3 G5 G6 G7 G9 G10 G14</w:t>
+            </w:r>
+          </w:p>
+        </w:tc>
+        <w:tc>
+          <w:tcPr>
+            <w:tcW w:type="dxa" w:w="6336"/>
+            <w:shd w:val="clear" w:fill="FFFFFF"/>
+            <w:tcMar>
+              <w:top w:w="75" w:type="dxa"/>
+              <w:left w:w="75" w:type="dxa"/>
+              <w:bottom w:w="75" w:type="dxa"/>
+              <w:right w:w="75" w:type="dxa"/>
+            </w:tcMar>
+            <w:vAlign w:val="center"/>
+          </w:tcPr>
+          <w:p>
+            <w:pPr>
+              <w:keepNext w:val="0"/>
+              <w:spacing w:after="0" w:line="250" w:lineRule="auto"/>
+            </w:pPr>
+            <w:r>
+              <w:rPr>
+                <w:rFonts w:ascii="Arial" w:hAnsi="Arial"/>
+                <w:b w:val="0"/>
+                <w:color w:val="000000"/>
+                <w:sz w:val="18"/>
+              </w:rPr>
+              <w:t>Sign-up error over_email_send_rate_limit. "We couldn't create your account. Please try again."</w:t>
+            </w:r>
+          </w:p>
+        </w:tc>
+        <w:tc>
+          <w:tcPr>
+            <w:tcW w:type="dxa" w:w="4219"/>
+            <w:shd w:val="clear" w:fill="FFFFFF"/>
+            <w:tcMar>
+              <w:top w:w="75" w:type="dxa"/>
+              <w:left w:w="75" w:type="dxa"/>
+              <w:bottom w:w="75" w:type="dxa"/>
+              <w:right w:w="75" w:type="dxa"/>
+            </w:tcMar>
+            <w:vAlign w:val="center"/>
+          </w:tcPr>
+          <w:p>
+            <w:pPr>
+              <w:keepNext w:val="0"/>
+              <w:spacing w:after="0" w:line="250" w:lineRule="auto"/>
+            </w:pPr>
+            <w:r>
+              <w:rPr>
+                <w:rFonts w:ascii="Arial" w:hAnsi="Arial"/>
+                <w:b w:val="0"/>
+                <w:color w:val="000000"/>
+                <w:sz w:val="18"/>
+              </w:rPr>
+              <w:t>Pass; WB-G5 actual equals expected.</w:t>
+            </w:r>
+          </w:p>
+        </w:tc>
+      </w:tr>
+      <w:tr>
+        <w:trPr>
+          <w:cantSplit/>
+        </w:trPr>
+        <w:tc>
+          <w:tcPr>
+            <w:tcW w:type="dxa" w:w="792"/>
+            <w:shd w:val="clear" w:fill="FFFFFF"/>
+            <w:tcMar>
+              <w:top w:w="75" w:type="dxa"/>
+              <w:left w:w="75" w:type="dxa"/>
+              <w:bottom w:w="75" w:type="dxa"/>
+              <w:right w:w="75" w:type="dxa"/>
+            </w:tcMar>
+            <w:vAlign w:val="center"/>
+          </w:tcPr>
+          <w:p>
+            <w:pPr>
+              <w:keepNext w:val="0"/>
+              <w:spacing w:after="0" w:line="250" w:lineRule="auto"/>
+              <w:jc w:val="center"/>
+            </w:pPr>
+            <w:r>
+              <w:rPr>
+                <w:rFonts w:ascii="Arial" w:hAnsi="Arial"/>
+                <w:b w:val="0"/>
+                <w:color w:val="000000"/>
+                <w:sz w:val="18"/>
+              </w:rPr>
+              <w:t>G6</w:t>
+            </w:r>
+          </w:p>
+        </w:tc>
+        <w:tc>
+          <w:tcPr>
+            <w:tcW w:type="dxa" w:w="3744"/>
+            <w:shd w:val="clear" w:fill="FFFFFF"/>
+            <w:tcMar>
+              <w:top w:w="75" w:type="dxa"/>
+              <w:left w:w="75" w:type="dxa"/>
+              <w:bottom w:w="75" w:type="dxa"/>
+              <w:right w:w="75" w:type="dxa"/>
+            </w:tcMar>
+            <w:vAlign w:val="center"/>
+          </w:tcPr>
+          <w:p>
+            <w:pPr>
+              <w:keepNext w:val="0"/>
+              <w:spacing w:after="0" w:line="250" w:lineRule="auto"/>
+            </w:pPr>
+            <w:r>
+              <w:rPr>
+                <w:rFonts w:ascii="Arial" w:hAnsi="Arial"/>
+                <w:b w:val="0"/>
+                <w:color w:val="000000"/>
+                <w:sz w:val="18"/>
+              </w:rPr>
+              <w:t>G0 G1 G3 G5 G6 G7 G9 G11 G12 G14</w:t>
+            </w:r>
+          </w:p>
+        </w:tc>
+        <w:tc>
+          <w:tcPr>
+            <w:tcW w:type="dxa" w:w="6336"/>
+            <w:shd w:val="clear" w:fill="FFFFFF"/>
+            <w:tcMar>
+              <w:top w:w="75" w:type="dxa"/>
+              <w:left w:w="75" w:type="dxa"/>
+              <w:bottom w:w="75" w:type="dxa"/>
+              <w:right w:w="75" w:type="dxa"/>
+            </w:tcMar>
+            <w:vAlign w:val="center"/>
+          </w:tcPr>
+          <w:p>
+            <w:pPr>
+              <w:keepNext w:val="0"/>
+              <w:spacing w:after="0" w:line="250" w:lineRule="auto"/>
+            </w:pPr>
+            <w:r>
+              <w:rPr>
+                <w:rFonts w:ascii="Arial" w:hAnsi="Arial"/>
+                <w:b w:val="0"/>
+                <w:color w:val="000000"/>
+                <w:sz w:val="18"/>
+              </w:rPr>
+              <w:t>New user without a session. check-email: "Account created. Check your email for a confirmation link, then log in."</w:t>
+            </w:r>
+          </w:p>
+        </w:tc>
+        <w:tc>
+          <w:tcPr>
+            <w:tcW w:type="dxa" w:w="4219"/>
+            <w:shd w:val="clear" w:fill="FFFFFF"/>
+            <w:tcMar>
+              <w:top w:w="75" w:type="dxa"/>
+              <w:left w:w="75" w:type="dxa"/>
+              <w:bottom w:w="75" w:type="dxa"/>
+              <w:right w:w="75" w:type="dxa"/>
+            </w:tcMar>
+            <w:vAlign w:val="center"/>
+          </w:tcPr>
+          <w:p>
+            <w:pPr>
+              <w:keepNext w:val="0"/>
+              <w:spacing w:after="0" w:line="250" w:lineRule="auto"/>
+            </w:pPr>
+            <w:r>
+              <w:rPr>
+                <w:rFonts w:ascii="Arial" w:hAnsi="Arial"/>
+                <w:b w:val="0"/>
+                <w:color w:val="000000"/>
+                <w:sz w:val="18"/>
+              </w:rPr>
+              <w:t>Pass; WB-G6 actual equals expected.</w:t>
+            </w:r>
+          </w:p>
+        </w:tc>
+      </w:tr>
+      <w:tr>
+        <w:trPr>
+          <w:cantSplit/>
+        </w:trPr>
+        <w:tc>
+          <w:tcPr>
+            <w:tcW w:type="dxa" w:w="792"/>
+            <w:shd w:val="clear" w:fill="FFFFFF"/>
+            <w:tcMar>
+              <w:top w:w="75" w:type="dxa"/>
+              <w:left w:w="75" w:type="dxa"/>
+              <w:bottom w:w="75" w:type="dxa"/>
+              <w:right w:w="75" w:type="dxa"/>
+            </w:tcMar>
+            <w:vAlign w:val="center"/>
+          </w:tcPr>
+          <w:p>
+            <w:pPr>
+              <w:keepNext w:val="0"/>
+              <w:spacing w:after="0" w:line="250" w:lineRule="auto"/>
+              <w:jc w:val="center"/>
+            </w:pPr>
+            <w:r>
+              <w:rPr>
+                <w:rFonts w:ascii="Arial" w:hAnsi="Arial"/>
+                <w:b w:val="0"/>
+                <w:color w:val="000000"/>
+                <w:sz w:val="18"/>
+              </w:rPr>
+              <w:t>G7</w:t>
+            </w:r>
+          </w:p>
+        </w:tc>
+        <w:tc>
+          <w:tcPr>
+            <w:tcW w:type="dxa" w:w="3744"/>
+            <w:shd w:val="clear" w:fill="FFFFFF"/>
+            <w:tcMar>
+              <w:top w:w="75" w:type="dxa"/>
+              <w:left w:w="75" w:type="dxa"/>
+              <w:bottom w:w="75" w:type="dxa"/>
+              <w:right w:w="75" w:type="dxa"/>
+            </w:tcMar>
+            <w:vAlign w:val="center"/>
+          </w:tcPr>
+          <w:p>
+            <w:pPr>
+              <w:keepNext w:val="0"/>
+              <w:spacing w:after="0" w:line="250" w:lineRule="auto"/>
+            </w:pPr>
+            <w:r>
+              <w:rPr>
+                <w:rFonts w:ascii="Arial" w:hAnsi="Arial"/>
+                <w:b w:val="0"/>
+                <w:color w:val="000000"/>
+                <w:sz w:val="18"/>
+              </w:rPr>
+              <w:t>G0 G1 G3 G5 G6 G7 G9 G11 G13 G14</w:t>
+            </w:r>
+          </w:p>
+        </w:tc>
+        <w:tc>
+          <w:tcPr>
+            <w:tcW w:type="dxa" w:w="6336"/>
+            <w:shd w:val="clear" w:fill="FFFFFF"/>
+            <w:tcMar>
+              <w:top w:w="75" w:type="dxa"/>
+              <w:left w:w="75" w:type="dxa"/>
+              <w:bottom w:w="75" w:type="dxa"/>
+              <w:right w:w="75" w:type="dxa"/>
+            </w:tcMar>
+            <w:vAlign w:val="center"/>
+          </w:tcPr>
+          <w:p>
+            <w:pPr>
+              <w:keepNext w:val="0"/>
+              <w:spacing w:after="0" w:line="250" w:lineRule="auto"/>
+            </w:pPr>
+            <w:r>
+              <w:rPr>
+                <w:rFonts w:ascii="Arial" w:hAnsi="Arial"/>
+                <w:b w:val="0"/>
+                <w:color w:val="000000"/>
+                <w:sz w:val="18"/>
+              </w:rPr>
+              <w:t>New user with a session; next=/groups/join/abc. Redirected to /groups/join/abc.</w:t>
+            </w:r>
+          </w:p>
+        </w:tc>
+        <w:tc>
+          <w:tcPr>
+            <w:tcW w:type="dxa" w:w="4219"/>
+            <w:shd w:val="clear" w:fill="FFFFFF"/>
+            <w:tcMar>
+              <w:top w:w="75" w:type="dxa"/>
+              <w:left w:w="75" w:type="dxa"/>
+              <w:bottom w:w="75" w:type="dxa"/>
+              <w:right w:w="75" w:type="dxa"/>
+            </w:tcMar>
+            <w:vAlign w:val="center"/>
+          </w:tcPr>
+          <w:p>
+            <w:pPr>
+              <w:keepNext w:val="0"/>
+              <w:spacing w:after="0" w:line="250" w:lineRule="auto"/>
+            </w:pPr>
+            <w:r>
+              <w:rPr>
+                <w:rFonts w:ascii="Arial" w:hAnsi="Arial"/>
+                <w:b w:val="0"/>
+                <w:color w:val="000000"/>
+                <w:sz w:val="18"/>
+              </w:rPr>
+              <w:t>Pass; WB-G7 actual equals expected.</w:t>
+            </w:r>
+          </w:p>
+        </w:tc>
+      </w:tr>
+    </w:tbl>
+    <w:p>
+      <w:pPr>
+        <w:spacing w:after="20"/>
+      </w:pPr>
+    </w:p>
+    <w:p>
+      <w:r>
+        <w:rPr>
+          <w:b w:val="0"/>
+          <w:sz w:val="18"/>
+        </w:rPr>
+        <w:t>Each path adds at least one edge the earlier paths did not use, and together the seven paths use all 20 edges.</w:t>
+      </w:r>
+    </w:p>
+    <w:p>
+      <w:r>
+        <w:rPr>
+          <w:b w:val="0"/>
+          <w:sz w:val="18"/>
+        </w:rPr>
+        <w:t>G2 and G4 also check that Supabase sign-up is never called when the request is rejected early.</w:t>
+      </w:r>
+    </w:p>
+    <w:p>
+      <w:r>
+        <w:rPr>
+          <w:b w:val="0"/>
+          <w:sz w:val="18"/>
+        </w:rPr>
+        <w:t>Evidence: tests/lab4/auth-profile-basis-path.test.ts (describe "registerUser") and evidence/auth-profile-basis-path-observations.json. Supabase is a test double; no account was created.</w:t>
+      </w:r>
+    </w:p>
+    <w:p>
+      <w:r>
+        <w:br w:type="page"/>
+      </w:r>
+    </w:p>
+    <w:p>
+      <w:pPr>
+        <w:pStyle w:val="Heading1"/>
+      </w:pPr>
+      <w:r>
+        <w:t>White box testing UC1-02</w:t>
+      </w:r>
+    </w:p>
+    <w:p>
+      <w:pPr>
+        <w:pStyle w:val="Heading2"/>
+      </w:pPr>
+      <w:r>
+        <w:t>safeRedirectPath: where to go after login</w:t>
+      </w:r>
+    </w:p>
+    <w:p>
+      <w:r>
+        <w:rPr>
+          <w:b w:val="0"/>
+          <w:sz w:val="18"/>
+        </w:rPr>
+        <w:t>Source: app/(auth)/redirect-path.ts:12-21</w:t>
+      </w:r>
+    </w:p>
+    <w:p>
+      <w:r>
+        <w:rPr>
+          <w:b w:val="0"/>
+          <w:sz w:val="19"/>
+        </w:rPr>
+        <w:t>Graph one call of safeRedirectPath. The two operands of each OR are separate decisions. hasUnsafeCharacters, isAuthPage and the path split are single steps; their internals are outside the graph.</w:t>
+      </w:r>
+    </w:p>
+    <w:p>
+      <w:pPr>
+        <w:jc w:val="center"/>
+      </w:pPr>
+      <w:r>
+        <w:drawing>
+          <wp:inline xmlns:a="http://schemas.openxmlformats.org/drawingml/2006/main" xmlns:pic="http://schemas.openxmlformats.org/drawingml/2006/picture">
+            <wp:extent cx="8618950" cy="2103120"/>
+            <wp:docPr id="2" name="Picture 2" descr="safe redirect path cfg control flow graph"/>
+            <wp:cNvGraphicFramePr>
+              <a:graphicFrameLocks noChangeAspect="1"/>
+            </wp:cNvGraphicFramePr>
+            <a:graphic>
+              <a:graphicData uri="http://schemas.openxmlformats.org/drawingml/2006/picture">
+                <pic:pic>
+                  <pic:nvPicPr>
+                    <pic:cNvPr id="0" name="safe-redirect-path-cfg.png"/>
+                    <pic:cNvPicPr/>
+                  </pic:nvPicPr>
+                  <pic:blipFill>
+                    <a:blip r:embed="rId11"/>
+                    <a:stretch>
+                      <a:fillRect/>
+                    </a:stretch>
+                  </pic:blipFill>
+                  <pic:spPr>
+                    <a:xfrm>
+                      <a:off x="0" y="0"/>
+                      <a:ext cx="8618950" cy="2103120"/>
+                    </a:xfrm>
+                    <a:prstGeom prst="rect"/>
+                  </pic:spPr>
+                </pic:pic>
+              </a:graphicData>
+            </a:graphic>
+          </wp:inline>
+        </w:drawing>
+      </w:r>
+    </w:p>
+    <w:p>
+      <w:r>
+        <w:rPr>
+          <w:b/>
+          <w:sz w:val="20"/>
+        </w:rPr>
+        <w:t>Cyclomatic complexity V(G) = 18 - 12 + 2 = 8. Seven decisions (S1-S5, S7, S8) also give 7 + 1 = 8.</w:t>
+      </w:r>
+    </w:p>
+    <w:p>
+      <w:r>
+        <w:br w:type="page"/>
+      </w:r>
+    </w:p>
+    <w:p>
+      <w:pPr>
+        <w:pStyle w:val="Heading1"/>
+      </w:pPr>
+      <w:r>
+        <w:t>Basis paths for UC1-02</w:t>
+      </w:r>
+    </w:p>
+    <w:p>
+      <w:r>
+        <w:rPr>
+          <w:b/>
+          <w:sz w:val="22"/>
+        </w:rPr>
+        <w:t>safeRedirectPath: where to go after login</w:t>
+      </w:r>
+    </w:p>
+    <w:tbl>
+      <w:tblPr>
+        <w:tblW w:type="auto" w:w="0"/>
+        <w:jc w:val="center"/>
+        <w:tblBorders>
+          <w:top w:val="single" w:sz="4" w:color="D9D9D9"/>
+          <w:left w:val="single" w:sz="4" w:color="D9D9D9"/>
+          <w:bottom w:val="single" w:sz="4" w:color="D9D9D9"/>
+          <w:right w:val="single" w:sz="4" w:color="D9D9D9"/>
+          <w:insideH w:val="single" w:sz="4" w:color="D9D9D9"/>
+          <w:insideV w:val="single" w:sz="4" w:color="D9D9D9"/>
+        </w:tblBorders>
+        <w:tblLayout w:type="fixed"/>
+        <w:tblLook w:firstColumn="1" w:firstRow="1" w:lastColumn="0" w:lastRow="0" w:noHBand="0" w:noVBand="1" w:val="04A0"/>
+      </w:tblPr>
+      <w:tblGrid>
+        <w:gridCol w:w="792"/>
+        <w:gridCol w:w="3744"/>
+        <w:gridCol w:w="6336"/>
+        <w:gridCol w:w="4219"/>
+      </w:tblGrid>
+      <w:tr>
+        <w:trPr>
+          <w:cantSplit/>
+          <w:tblHeader/>
+        </w:trPr>
+        <w:tc>
+          <w:tcPr>
+            <w:tcW w:type="dxa" w:w="792"/>
+            <w:shd w:val="clear" w:fill="E7E7E7"/>
+            <w:tcMar>
+              <w:top w:w="75" w:type="dxa"/>
+              <w:left w:w="75" w:type="dxa"/>
+              <w:bottom w:w="75" w:type="dxa"/>
+              <w:right w:w="75" w:type="dxa"/>
+            </w:tcMar>
+            <w:vAlign w:val="center"/>
+          </w:tcPr>
+          <w:p>
+            <w:pPr>
+              <w:keepNext/>
+              <w:spacing w:after="0" w:line="250" w:lineRule="auto"/>
+              <w:jc w:val="center"/>
+            </w:pPr>
+            <w:r>
+              <w:rPr>
+                <w:rFonts w:ascii="Arial" w:hAnsi="Arial"/>
+                <w:b/>
+                <w:color w:val="000000"/>
+                <w:sz w:val="18"/>
+              </w:rPr>
+              <w:t>Path</w:t>
+            </w:r>
+          </w:p>
+        </w:tc>
+        <w:tc>
+          <w:tcPr>
+            <w:tcW w:type="dxa" w:w="3744"/>
+            <w:shd w:val="clear" w:fill="E7E7E7"/>
+            <w:tcMar>
+              <w:top w:w="75" w:type="dxa"/>
+              <w:left w:w="75" w:type="dxa"/>
+              <w:bottom w:w="75" w:type="dxa"/>
+              <w:right w:w="75" w:type="dxa"/>
+            </w:tcMar>
+            <w:vAlign w:val="center"/>
+          </w:tcPr>
+          <w:p>
+            <w:pPr>
+              <w:keepNext/>
+              <w:spacing w:after="0" w:line="250" w:lineRule="auto"/>
+            </w:pPr>
+            <w:r>
+              <w:rPr>
+                <w:rFonts w:ascii="Arial" w:hAnsi="Arial"/>
+                <w:b/>
+                <w:color w:val="000000"/>
+                <w:sz w:val="18"/>
+              </w:rPr>
+              <w:t>Basis set of nodes</w:t>
+            </w:r>
+          </w:p>
+        </w:tc>
+        <w:tc>
+          <w:tcPr>
+            <w:tcW w:type="dxa" w:w="6336"/>
+            <w:shd w:val="clear" w:fill="E7E7E7"/>
+            <w:tcMar>
+              <w:top w:w="75" w:type="dxa"/>
+              <w:left w:w="75" w:type="dxa"/>
+              <w:bottom w:w="75" w:type="dxa"/>
+              <w:right w:w="75" w:type="dxa"/>
+            </w:tcMar>
+            <w:vAlign w:val="center"/>
+          </w:tcPr>
+          <w:p>
+            <w:pPr>
+              <w:keepNext/>
+              <w:spacing w:after="0" w:line="250" w:lineRule="auto"/>
+            </w:pPr>
+            <w:r>
+              <w:rPr>
+                <w:rFonts w:ascii="Arial" w:hAnsi="Arial"/>
+                <w:b/>
+                <w:color w:val="000000"/>
+                <w:sz w:val="18"/>
+              </w:rPr>
+              <w:t>Input and expected output</w:t>
+            </w:r>
+          </w:p>
+        </w:tc>
+        <w:tc>
+          <w:tcPr>
+            <w:tcW w:type="dxa" w:w="4219"/>
+            <w:shd w:val="clear" w:fill="E7E7E7"/>
+            <w:tcMar>
+              <w:top w:w="75" w:type="dxa"/>
+              <w:left w:w="75" w:type="dxa"/>
+              <w:bottom w:w="75" w:type="dxa"/>
+              <w:right w:w="75" w:type="dxa"/>
+            </w:tcMar>
+            <w:vAlign w:val="center"/>
+          </w:tcPr>
+          <w:p>
+            <w:pPr>
+              <w:keepNext/>
+              <w:spacing w:after="0" w:line="250" w:lineRule="auto"/>
+            </w:pPr>
+            <w:r>
+              <w:rPr>
+                <w:rFonts w:ascii="Arial" w:hAnsi="Arial"/>
+                <w:b/>
+                <w:color w:val="000000"/>
+                <w:sz w:val="18"/>
+              </w:rPr>
+              <w:t>Execution evidence</w:t>
+            </w:r>
+          </w:p>
+        </w:tc>
+      </w:tr>
+      <w:tr>
+        <w:trPr>
+          <w:cantSplit/>
+        </w:trPr>
+        <w:tc>
+          <w:tcPr>
+            <w:tcW w:type="dxa" w:w="792"/>
+            <w:shd w:val="clear" w:fill="FFFFFF"/>
+            <w:tcMar>
+              <w:top w:w="75" w:type="dxa"/>
+              <w:left w:w="75" w:type="dxa"/>
+              <w:bottom w:w="75" w:type="dxa"/>
+              <w:right w:w="75" w:type="dxa"/>
+            </w:tcMar>
+            <w:vAlign w:val="center"/>
+          </w:tcPr>
+          <w:p>
+            <w:pPr>
+              <w:keepNext w:val="0"/>
+              <w:spacing w:after="0" w:line="250" w:lineRule="auto"/>
+              <w:jc w:val="center"/>
+            </w:pPr>
+            <w:r>
+              <w:rPr>
+                <w:rFonts w:ascii="Arial" w:hAnsi="Arial"/>
+                <w:b w:val="0"/>
+                <w:color w:val="000000"/>
+                <w:sz w:val="18"/>
+              </w:rPr>
+              <w:t>S1</w:t>
+            </w:r>
+          </w:p>
+        </w:tc>
+        <w:tc>
+          <w:tcPr>
+            <w:tcW w:type="dxa" w:w="3744"/>
+            <w:shd w:val="clear" w:fill="FFFFFF"/>
+            <w:tcMar>
+              <w:top w:w="75" w:type="dxa"/>
+              <w:left w:w="75" w:type="dxa"/>
+              <w:bottom w:w="75" w:type="dxa"/>
+              <w:right w:w="75" w:type="dxa"/>
+            </w:tcMar>
+            <w:vAlign w:val="center"/>
+          </w:tcPr>
+          <w:p>
+            <w:pPr>
+              <w:keepNext w:val="0"/>
+              <w:spacing w:after="0" w:line="250" w:lineRule="auto"/>
+            </w:pPr>
+            <w:r>
+              <w:rPr>
+                <w:rFonts w:ascii="Arial" w:hAnsi="Arial"/>
+                <w:b w:val="0"/>
+                <w:color w:val="000000"/>
+                <w:sz w:val="18"/>
+              </w:rPr>
+              <w:t>S0 S1 S9 S11</w:t>
+            </w:r>
+          </w:p>
+        </w:tc>
+        <w:tc>
+          <w:tcPr>
+            <w:tcW w:type="dxa" w:w="6336"/>
+            <w:shd w:val="clear" w:fill="FFFFFF"/>
+            <w:tcMar>
+              <w:top w:w="75" w:type="dxa"/>
+              <w:left w:w="75" w:type="dxa"/>
+              <w:bottom w:w="75" w:type="dxa"/>
+              <w:right w:w="75" w:type="dxa"/>
+            </w:tcMar>
+            <w:vAlign w:val="center"/>
+          </w:tcPr>
+          <w:p>
+            <w:pPr>
+              <w:keepNext w:val="0"/>
+              <w:spacing w:after="0" w:line="250" w:lineRule="auto"/>
+            </w:pPr>
+            <w:r>
+              <w:rPr>
+                <w:rFonts w:ascii="Arial" w:hAnsi="Arial"/>
+                <w:b w:val="0"/>
+                <w:color w:val="000000"/>
+                <w:sz w:val="18"/>
+              </w:rPr>
+              <w:t>undefined. Returns Home "/".</w:t>
+            </w:r>
+          </w:p>
+        </w:tc>
+        <w:tc>
+          <w:tcPr>
+            <w:tcW w:type="dxa" w:w="4219"/>
+            <w:shd w:val="clear" w:fill="FFFFFF"/>
+            <w:tcMar>
+              <w:top w:w="75" w:type="dxa"/>
+              <w:left w:w="75" w:type="dxa"/>
+              <w:bottom w:w="75" w:type="dxa"/>
+              <w:right w:w="75" w:type="dxa"/>
+            </w:tcMar>
+            <w:vAlign w:val="center"/>
+          </w:tcPr>
+          <w:p>
+            <w:pPr>
+              <w:keepNext w:val="0"/>
+              <w:spacing w:after="0" w:line="250" w:lineRule="auto"/>
+            </w:pPr>
+            <w:r>
+              <w:rPr>
+                <w:rFonts w:ascii="Arial" w:hAnsi="Arial"/>
+                <w:b w:val="0"/>
+                <w:color w:val="000000"/>
+                <w:sz w:val="18"/>
+              </w:rPr>
+              <w:t>Pass; WB-S1 actual equals expected.</w:t>
+            </w:r>
+          </w:p>
+        </w:tc>
+      </w:tr>
+      <w:tr>
+        <w:trPr>
+          <w:cantSplit/>
+        </w:trPr>
+        <w:tc>
+          <w:tcPr>
+            <w:tcW w:type="dxa" w:w="792"/>
+            <w:shd w:val="clear" w:fill="FFFFFF"/>
+            <w:tcMar>
+              <w:top w:w="75" w:type="dxa"/>
+              <w:left w:w="75" w:type="dxa"/>
+              <w:bottom w:w="75" w:type="dxa"/>
+              <w:right w:w="75" w:type="dxa"/>
+            </w:tcMar>
+            <w:vAlign w:val="center"/>
+          </w:tcPr>
+          <w:p>
+            <w:pPr>
+              <w:keepNext w:val="0"/>
+              <w:spacing w:after="0" w:line="250" w:lineRule="auto"/>
+              <w:jc w:val="center"/>
+            </w:pPr>
+            <w:r>
+              <w:rPr>
+                <w:rFonts w:ascii="Arial" w:hAnsi="Arial"/>
+                <w:b w:val="0"/>
+                <w:color w:val="000000"/>
+                <w:sz w:val="18"/>
+              </w:rPr>
+              <w:t>S2</w:t>
+            </w:r>
+          </w:p>
+        </w:tc>
+        <w:tc>
+          <w:tcPr>
+            <w:tcW w:type="dxa" w:w="3744"/>
+            <w:shd w:val="clear" w:fill="FFFFFF"/>
+            <w:tcMar>
+              <w:top w:w="75" w:type="dxa"/>
+              <w:left w:w="75" w:type="dxa"/>
+              <w:bottom w:w="75" w:type="dxa"/>
+              <w:right w:w="75" w:type="dxa"/>
+            </w:tcMar>
+            <w:vAlign w:val="center"/>
+          </w:tcPr>
+          <w:p>
+            <w:pPr>
+              <w:keepNext w:val="0"/>
+              <w:spacing w:after="0" w:line="250" w:lineRule="auto"/>
+            </w:pPr>
+            <w:r>
+              <w:rPr>
+                <w:rFonts w:ascii="Arial" w:hAnsi="Arial"/>
+                <w:b w:val="0"/>
+                <w:color w:val="000000"/>
+                <w:sz w:val="18"/>
+              </w:rPr>
+              <w:t>S0 S1 S2 S9 S11</w:t>
+            </w:r>
+          </w:p>
+        </w:tc>
+        <w:tc>
+          <w:tcPr>
+            <w:tcW w:type="dxa" w:w="6336"/>
+            <w:shd w:val="clear" w:fill="FFFFFF"/>
+            <w:tcMar>
+              <w:top w:w="75" w:type="dxa"/>
+              <w:left w:w="75" w:type="dxa"/>
+              <w:bottom w:w="75" w:type="dxa"/>
+              <w:right w:w="75" w:type="dxa"/>
+            </w:tcMar>
+            <w:vAlign w:val="center"/>
+          </w:tcPr>
+          <w:p>
+            <w:pPr>
+              <w:keepNext w:val="0"/>
+              <w:spacing w:after="0" w:line="250" w:lineRule="auto"/>
+            </w:pPr>
+            <w:r>
+              <w:rPr>
+                <w:rFonts w:ascii="Arial" w:hAnsi="Arial"/>
+                <w:b w:val="0"/>
+                <w:color w:val="000000"/>
+                <w:sz w:val="18"/>
+              </w:rPr>
+              <w:t>"". Returns "/".</w:t>
+            </w:r>
+          </w:p>
+        </w:tc>
+        <w:tc>
+          <w:tcPr>
+            <w:tcW w:type="dxa" w:w="4219"/>
+            <w:shd w:val="clear" w:fill="FFFFFF"/>
+            <w:tcMar>
+              <w:top w:w="75" w:type="dxa"/>
+              <w:left w:w="75" w:type="dxa"/>
+              <w:bottom w:w="75" w:type="dxa"/>
+              <w:right w:w="75" w:type="dxa"/>
+            </w:tcMar>
+            <w:vAlign w:val="center"/>
+          </w:tcPr>
+          <w:p>
+            <w:pPr>
+              <w:keepNext w:val="0"/>
+              <w:spacing w:after="0" w:line="250" w:lineRule="auto"/>
+            </w:pPr>
+            <w:r>
+              <w:rPr>
+                <w:rFonts w:ascii="Arial" w:hAnsi="Arial"/>
+                <w:b w:val="0"/>
+                <w:color w:val="000000"/>
+                <w:sz w:val="18"/>
+              </w:rPr>
+              <w:t>Pass; WB-S2 actual equals expected.</w:t>
+            </w:r>
+          </w:p>
+        </w:tc>
+      </w:tr>
+      <w:tr>
+        <w:trPr>
+          <w:cantSplit/>
+        </w:trPr>
+        <w:tc>
+          <w:tcPr>
+            <w:tcW w:type="dxa" w:w="792"/>
+            <w:shd w:val="clear" w:fill="FFFFFF"/>
+            <w:tcMar>
+              <w:top w:w="75" w:type="dxa"/>
+              <w:left w:w="75" w:type="dxa"/>
+              <w:bottom w:w="75" w:type="dxa"/>
+              <w:right w:w="75" w:type="dxa"/>
+            </w:tcMar>
+            <w:vAlign w:val="center"/>
+          </w:tcPr>
+          <w:p>
+            <w:pPr>
+              <w:keepNext w:val="0"/>
+              <w:spacing w:after="0" w:line="250" w:lineRule="auto"/>
+              <w:jc w:val="center"/>
+            </w:pPr>
+            <w:r>
+              <w:rPr>
+                <w:rFonts w:ascii="Arial" w:hAnsi="Arial"/>
+                <w:b w:val="0"/>
+                <w:color w:val="000000"/>
+                <w:sz w:val="18"/>
+              </w:rPr>
+              <w:t>S3</w:t>
+            </w:r>
+          </w:p>
+        </w:tc>
+        <w:tc>
+          <w:tcPr>
+            <w:tcW w:type="dxa" w:w="3744"/>
+            <w:shd w:val="clear" w:fill="FFFFFF"/>
+            <w:tcMar>
+              <w:top w:w="75" w:type="dxa"/>
+              <w:left w:w="75" w:type="dxa"/>
+              <w:bottom w:w="75" w:type="dxa"/>
+              <w:right w:w="75" w:type="dxa"/>
+            </w:tcMar>
+            <w:vAlign w:val="center"/>
+          </w:tcPr>
+          <w:p>
+            <w:pPr>
+              <w:keepNext w:val="0"/>
+              <w:spacing w:after="0" w:line="250" w:lineRule="auto"/>
+            </w:pPr>
+            <w:r>
+              <w:rPr>
+                <w:rFonts w:ascii="Arial" w:hAnsi="Arial"/>
+                <w:b w:val="0"/>
+                <w:color w:val="000000"/>
+                <w:sz w:val="18"/>
+              </w:rPr>
+              <w:t>S0 S1 S2 S3 S9 S11</w:t>
+            </w:r>
+          </w:p>
+        </w:tc>
+        <w:tc>
+          <w:tcPr>
+            <w:tcW w:type="dxa" w:w="6336"/>
+            <w:shd w:val="clear" w:fill="FFFFFF"/>
+            <w:tcMar>
+              <w:top w:w="75" w:type="dxa"/>
+              <w:left w:w="75" w:type="dxa"/>
+              <w:bottom w:w="75" w:type="dxa"/>
+              <w:right w:w="75" w:type="dxa"/>
+            </w:tcMar>
+            <w:vAlign w:val="center"/>
+          </w:tcPr>
+          <w:p>
+            <w:pPr>
+              <w:keepNext w:val="0"/>
+              <w:spacing w:after="0" w:line="250" w:lineRule="auto"/>
+            </w:pPr>
+            <w:r>
+              <w:rPr>
+                <w:rFonts w:ascii="Arial" w:hAnsi="Arial"/>
+                <w:b w:val="0"/>
+                <w:color w:val="000000"/>
+                <w:sz w:val="18"/>
+              </w:rPr>
+              <w:t>"/\t/evil.example" (tab). Returns "/".</w:t>
+            </w:r>
+          </w:p>
+        </w:tc>
+        <w:tc>
+          <w:tcPr>
+            <w:tcW w:type="dxa" w:w="4219"/>
+            <w:shd w:val="clear" w:fill="FFFFFF"/>
+            <w:tcMar>
+              <w:top w:w="75" w:type="dxa"/>
+              <w:left w:w="75" w:type="dxa"/>
+              <w:bottom w:w="75" w:type="dxa"/>
+              <w:right w:w="75" w:type="dxa"/>
+            </w:tcMar>
+            <w:vAlign w:val="center"/>
+          </w:tcPr>
+          <w:p>
+            <w:pPr>
+              <w:keepNext w:val="0"/>
+              <w:spacing w:after="0" w:line="250" w:lineRule="auto"/>
+            </w:pPr>
+            <w:r>
+              <w:rPr>
+                <w:rFonts w:ascii="Arial" w:hAnsi="Arial"/>
+                <w:b w:val="0"/>
+                <w:color w:val="000000"/>
+                <w:sz w:val="18"/>
+              </w:rPr>
+              <w:t>Pass; WB-S3 actual equals expected.</w:t>
+            </w:r>
+          </w:p>
+        </w:tc>
+      </w:tr>
+      <w:tr>
+        <w:trPr>
+          <w:cantSplit/>
+        </w:trPr>
+        <w:tc>
+          <w:tcPr>
+            <w:tcW w:type="dxa" w:w="792"/>
+            <w:shd w:val="clear" w:fill="FFFFFF"/>
+            <w:tcMar>
+              <w:top w:w="75" w:type="dxa"/>
+              <w:left w:w="75" w:type="dxa"/>
+              <w:bottom w:w="75" w:type="dxa"/>
+              <w:right w:w="75" w:type="dxa"/>
+            </w:tcMar>
+            <w:vAlign w:val="center"/>
+          </w:tcPr>
+          <w:p>
+            <w:pPr>
+              <w:keepNext w:val="0"/>
+              <w:spacing w:after="0" w:line="250" w:lineRule="auto"/>
+              <w:jc w:val="center"/>
+            </w:pPr>
+            <w:r>
+              <w:rPr>
+                <w:rFonts w:ascii="Arial" w:hAnsi="Arial"/>
+                <w:b w:val="0"/>
+                <w:color w:val="000000"/>
+                <w:sz w:val="18"/>
+              </w:rPr>
+              <w:t>S4</w:t>
+            </w:r>
+          </w:p>
+        </w:tc>
+        <w:tc>
+          <w:tcPr>
+            <w:tcW w:type="dxa" w:w="3744"/>
+            <w:shd w:val="clear" w:fill="FFFFFF"/>
+            <w:tcMar>
+              <w:top w:w="75" w:type="dxa"/>
+              <w:left w:w="75" w:type="dxa"/>
+              <w:bottom w:w="75" w:type="dxa"/>
+              <w:right w:w="75" w:type="dxa"/>
+            </w:tcMar>
+            <w:vAlign w:val="center"/>
+          </w:tcPr>
+          <w:p>
+            <w:pPr>
+              <w:keepNext w:val="0"/>
+              <w:spacing w:after="0" w:line="250" w:lineRule="auto"/>
+            </w:pPr>
+            <w:r>
+              <w:rPr>
+                <w:rFonts w:ascii="Arial" w:hAnsi="Arial"/>
+                <w:b w:val="0"/>
+                <w:color w:val="000000"/>
+                <w:sz w:val="18"/>
+              </w:rPr>
+              <w:t>S0 S1 S2 S3 S4 S9 S11</w:t>
+            </w:r>
+          </w:p>
+        </w:tc>
+        <w:tc>
+          <w:tcPr>
+            <w:tcW w:type="dxa" w:w="6336"/>
+            <w:shd w:val="clear" w:fill="FFFFFF"/>
+            <w:tcMar>
+              <w:top w:w="75" w:type="dxa"/>
+              <w:left w:w="75" w:type="dxa"/>
+              <w:bottom w:w="75" w:type="dxa"/>
+              <w:right w:w="75" w:type="dxa"/>
+            </w:tcMar>
+            <w:vAlign w:val="center"/>
+          </w:tcPr>
+          <w:p>
+            <w:pPr>
+              <w:keepNext w:val="0"/>
+              <w:spacing w:after="0" w:line="250" w:lineRule="auto"/>
+            </w:pPr>
+            <w:r>
+              <w:rPr>
+                <w:rFonts w:ascii="Arial" w:hAnsi="Arial"/>
+                <w:b w:val="0"/>
+                <w:color w:val="000000"/>
+                <w:sz w:val="18"/>
+              </w:rPr>
+              <w:t>"https://evil.example". Returns "/".</w:t>
+            </w:r>
+          </w:p>
+        </w:tc>
+        <w:tc>
+          <w:tcPr>
+            <w:tcW w:type="dxa" w:w="4219"/>
+            <w:shd w:val="clear" w:fill="FFFFFF"/>
+            <w:tcMar>
+              <w:top w:w="75" w:type="dxa"/>
+              <w:left w:w="75" w:type="dxa"/>
+              <w:bottom w:w="75" w:type="dxa"/>
+              <w:right w:w="75" w:type="dxa"/>
+            </w:tcMar>
+            <w:vAlign w:val="center"/>
+          </w:tcPr>
+          <w:p>
+            <w:pPr>
+              <w:keepNext w:val="0"/>
+              <w:spacing w:after="0" w:line="250" w:lineRule="auto"/>
+            </w:pPr>
+            <w:r>
+              <w:rPr>
+                <w:rFonts w:ascii="Arial" w:hAnsi="Arial"/>
+                <w:b w:val="0"/>
+                <w:color w:val="000000"/>
+                <w:sz w:val="18"/>
+              </w:rPr>
+              <w:t>Pass; WB-S4 actual equals expected.</w:t>
+            </w:r>
+          </w:p>
+        </w:tc>
+      </w:tr>
+      <w:tr>
+        <w:trPr>
+          <w:cantSplit/>
+        </w:trPr>
+        <w:tc>
+          <w:tcPr>
+            <w:tcW w:type="dxa" w:w="792"/>
+            <w:shd w:val="clear" w:fill="FFFFFF"/>
+            <w:tcMar>
+              <w:top w:w="75" w:type="dxa"/>
+              <w:left w:w="75" w:type="dxa"/>
+              <w:bottom w:w="75" w:type="dxa"/>
+              <w:right w:w="75" w:type="dxa"/>
+            </w:tcMar>
+            <w:vAlign w:val="center"/>
+          </w:tcPr>
+          <w:p>
+            <w:pPr>
+              <w:keepNext w:val="0"/>
+              <w:spacing w:after="0" w:line="250" w:lineRule="auto"/>
+              <w:jc w:val="center"/>
+            </w:pPr>
+            <w:r>
+              <w:rPr>
+                <w:rFonts w:ascii="Arial" w:hAnsi="Arial"/>
+                <w:b w:val="0"/>
+                <w:color w:val="000000"/>
+                <w:sz w:val="18"/>
+              </w:rPr>
+              <w:t>S5</w:t>
+            </w:r>
+          </w:p>
+        </w:tc>
+        <w:tc>
+          <w:tcPr>
+            <w:tcW w:type="dxa" w:w="3744"/>
+            <w:shd w:val="clear" w:fill="FFFFFF"/>
+            <w:tcMar>
+              <w:top w:w="75" w:type="dxa"/>
+              <w:left w:w="75" w:type="dxa"/>
+              <w:bottom w:w="75" w:type="dxa"/>
+              <w:right w:w="75" w:type="dxa"/>
+            </w:tcMar>
+            <w:vAlign w:val="center"/>
+          </w:tcPr>
+          <w:p>
+            <w:pPr>
+              <w:keepNext w:val="0"/>
+              <w:spacing w:after="0" w:line="250" w:lineRule="auto"/>
+            </w:pPr>
+            <w:r>
+              <w:rPr>
+                <w:rFonts w:ascii="Arial" w:hAnsi="Arial"/>
+                <w:b w:val="0"/>
+                <w:color w:val="000000"/>
+                <w:sz w:val="18"/>
+              </w:rPr>
+              <w:t>S0 S1 S2 S3 S4 S5 S9 S11</w:t>
+            </w:r>
+          </w:p>
+        </w:tc>
+        <w:tc>
+          <w:tcPr>
+            <w:tcW w:type="dxa" w:w="6336"/>
+            <w:shd w:val="clear" w:fill="FFFFFF"/>
+            <w:tcMar>
+              <w:top w:w="75" w:type="dxa"/>
+              <w:left w:w="75" w:type="dxa"/>
+              <w:bottom w:w="75" w:type="dxa"/>
+              <w:right w:w="75" w:type="dxa"/>
+            </w:tcMar>
+            <w:vAlign w:val="center"/>
+          </w:tcPr>
+          <w:p>
+            <w:pPr>
+              <w:keepNext w:val="0"/>
+              <w:spacing w:after="0" w:line="250" w:lineRule="auto"/>
+            </w:pPr>
+            <w:r>
+              <w:rPr>
+                <w:rFonts w:ascii="Arial" w:hAnsi="Arial"/>
+                <w:b w:val="0"/>
+                <w:color w:val="000000"/>
+                <w:sz w:val="18"/>
+              </w:rPr>
+              <w:t>"//evil.example". Returns "/".</w:t>
+            </w:r>
+          </w:p>
+        </w:tc>
+        <w:tc>
+          <w:tcPr>
+            <w:tcW w:type="dxa" w:w="4219"/>
+            <w:shd w:val="clear" w:fill="FFFFFF"/>
+            <w:tcMar>
+              <w:top w:w="75" w:type="dxa"/>
+              <w:left w:w="75" w:type="dxa"/>
+              <w:bottom w:w="75" w:type="dxa"/>
+              <w:right w:w="75" w:type="dxa"/>
+            </w:tcMar>
+            <w:vAlign w:val="center"/>
+          </w:tcPr>
+          <w:p>
+            <w:pPr>
+              <w:keepNext w:val="0"/>
+              <w:spacing w:after="0" w:line="250" w:lineRule="auto"/>
+            </w:pPr>
+            <w:r>
+              <w:rPr>
+                <w:rFonts w:ascii="Arial" w:hAnsi="Arial"/>
+                <w:b w:val="0"/>
+                <w:color w:val="000000"/>
+                <w:sz w:val="18"/>
+              </w:rPr>
+              <w:t>Pass; WB-S5 actual equals expected.</w:t>
+            </w:r>
+          </w:p>
+        </w:tc>
+      </w:tr>
+      <w:tr>
+        <w:trPr>
+          <w:cantSplit/>
+        </w:trPr>
+        <w:tc>
+          <w:tcPr>
+            <w:tcW w:type="dxa" w:w="792"/>
+            <w:shd w:val="clear" w:fill="FFFFFF"/>
+            <w:tcMar>
+              <w:top w:w="75" w:type="dxa"/>
+              <w:left w:w="75" w:type="dxa"/>
+              <w:bottom w:w="75" w:type="dxa"/>
+              <w:right w:w="75" w:type="dxa"/>
+            </w:tcMar>
+            <w:vAlign w:val="center"/>
+          </w:tcPr>
+          <w:p>
+            <w:pPr>
+              <w:keepNext w:val="0"/>
+              <w:spacing w:after="0" w:line="250" w:lineRule="auto"/>
+              <w:jc w:val="center"/>
+            </w:pPr>
+            <w:r>
+              <w:rPr>
+                <w:rFonts w:ascii="Arial" w:hAnsi="Arial"/>
+                <w:b w:val="0"/>
+                <w:color w:val="000000"/>
+                <w:sz w:val="18"/>
+              </w:rPr>
+              <w:t>S6</w:t>
+            </w:r>
+          </w:p>
+        </w:tc>
+        <w:tc>
+          <w:tcPr>
+            <w:tcW w:type="dxa" w:w="3744"/>
+            <w:shd w:val="clear" w:fill="FFFFFF"/>
+            <w:tcMar>
+              <w:top w:w="75" w:type="dxa"/>
+              <w:left w:w="75" w:type="dxa"/>
+              <w:bottom w:w="75" w:type="dxa"/>
+              <w:right w:w="75" w:type="dxa"/>
+            </w:tcMar>
+            <w:vAlign w:val="center"/>
+          </w:tcPr>
+          <w:p>
+            <w:pPr>
+              <w:keepNext w:val="0"/>
+              <w:spacing w:after="0" w:line="250" w:lineRule="auto"/>
+            </w:pPr>
+            <w:r>
+              <w:rPr>
+                <w:rFonts w:ascii="Arial" w:hAnsi="Arial"/>
+                <w:b w:val="0"/>
+                <w:color w:val="000000"/>
+                <w:sz w:val="18"/>
+              </w:rPr>
+              <w:t>S0 S1 S2 S3 S4 S5 S6 S7 S9 S11</w:t>
+            </w:r>
+          </w:p>
+        </w:tc>
+        <w:tc>
+          <w:tcPr>
+            <w:tcW w:type="dxa" w:w="6336"/>
+            <w:shd w:val="clear" w:fill="FFFFFF"/>
+            <w:tcMar>
+              <w:top w:w="75" w:type="dxa"/>
+              <w:left w:w="75" w:type="dxa"/>
+              <w:bottom w:w="75" w:type="dxa"/>
+              <w:right w:w="75" w:type="dxa"/>
+            </w:tcMar>
+            <w:vAlign w:val="center"/>
+          </w:tcPr>
+          <w:p>
+            <w:pPr>
+              <w:keepNext w:val="0"/>
+              <w:spacing w:after="0" w:line="250" w:lineRule="auto"/>
+            </w:pPr>
+            <w:r>
+              <w:rPr>
+                <w:rFonts w:ascii="Arial" w:hAnsi="Arial"/>
+                <w:b w:val="0"/>
+                <w:color w:val="000000"/>
+                <w:sz w:val="18"/>
+              </w:rPr>
+              <w:t>"/login?next=/wallet". Returns "/".</w:t>
+            </w:r>
+          </w:p>
+        </w:tc>
+        <w:tc>
+          <w:tcPr>
+            <w:tcW w:type="dxa" w:w="4219"/>
+            <w:shd w:val="clear" w:fill="FFFFFF"/>
+            <w:tcMar>
+              <w:top w:w="75" w:type="dxa"/>
+              <w:left w:w="75" w:type="dxa"/>
+              <w:bottom w:w="75" w:type="dxa"/>
+              <w:right w:w="75" w:type="dxa"/>
+            </w:tcMar>
+            <w:vAlign w:val="center"/>
+          </w:tcPr>
+          <w:p>
+            <w:pPr>
+              <w:keepNext w:val="0"/>
+              <w:spacing w:after="0" w:line="250" w:lineRule="auto"/>
+            </w:pPr>
+            <w:r>
+              <w:rPr>
+                <w:rFonts w:ascii="Arial" w:hAnsi="Arial"/>
+                <w:b w:val="0"/>
+                <w:color w:val="000000"/>
+                <w:sz w:val="18"/>
+              </w:rPr>
+              <w:t>Pass; WB-S6 actual equals expected.</w:t>
+            </w:r>
+          </w:p>
+        </w:tc>
+      </w:tr>
+      <w:tr>
+        <w:trPr>
+          <w:cantSplit/>
+        </w:trPr>
+        <w:tc>
+          <w:tcPr>
+            <w:tcW w:type="dxa" w:w="792"/>
+            <w:shd w:val="clear" w:fill="FFFFFF"/>
+            <w:tcMar>
+              <w:top w:w="75" w:type="dxa"/>
+              <w:left w:w="75" w:type="dxa"/>
+              <w:bottom w:w="75" w:type="dxa"/>
+              <w:right w:w="75" w:type="dxa"/>
+            </w:tcMar>
+            <w:vAlign w:val="center"/>
+          </w:tcPr>
+          <w:p>
+            <w:pPr>
+              <w:keepNext w:val="0"/>
+              <w:spacing w:after="0" w:line="250" w:lineRule="auto"/>
+              <w:jc w:val="center"/>
+            </w:pPr>
+            <w:r>
+              <w:rPr>
+                <w:rFonts w:ascii="Arial" w:hAnsi="Arial"/>
+                <w:b w:val="0"/>
+                <w:color w:val="000000"/>
+                <w:sz w:val="18"/>
+              </w:rPr>
+              <w:t>S7</w:t>
+            </w:r>
+          </w:p>
+        </w:tc>
+        <w:tc>
+          <w:tcPr>
+            <w:tcW w:type="dxa" w:w="3744"/>
+            <w:shd w:val="clear" w:fill="FFFFFF"/>
+            <w:tcMar>
+              <w:top w:w="75" w:type="dxa"/>
+              <w:left w:w="75" w:type="dxa"/>
+              <w:bottom w:w="75" w:type="dxa"/>
+              <w:right w:w="75" w:type="dxa"/>
+            </w:tcMar>
+            <w:vAlign w:val="center"/>
+          </w:tcPr>
+          <w:p>
+            <w:pPr>
+              <w:keepNext w:val="0"/>
+              <w:spacing w:after="0" w:line="250" w:lineRule="auto"/>
+            </w:pPr>
+            <w:r>
+              <w:rPr>
+                <w:rFonts w:ascii="Arial" w:hAnsi="Arial"/>
+                <w:b w:val="0"/>
+                <w:color w:val="000000"/>
+                <w:sz w:val="18"/>
+              </w:rPr>
+              <w:t>S0 S1 S2 S3 S4 S5 S6 S7 S8 S9 S11</w:t>
+            </w:r>
+          </w:p>
+        </w:tc>
+        <w:tc>
+          <w:tcPr>
+            <w:tcW w:type="dxa" w:w="6336"/>
+            <w:shd w:val="clear" w:fill="FFFFFF"/>
+            <w:tcMar>
+              <w:top w:w="75" w:type="dxa"/>
+              <w:left w:w="75" w:type="dxa"/>
+              <w:bottom w:w="75" w:type="dxa"/>
+              <w:right w:w="75" w:type="dxa"/>
+            </w:tcMar>
+            <w:vAlign w:val="center"/>
+          </w:tcPr>
+          <w:p>
+            <w:pPr>
+              <w:keepNext w:val="0"/>
+              <w:spacing w:after="0" w:line="250" w:lineRule="auto"/>
+            </w:pPr>
+            <w:r>
+              <w:rPr>
+                <w:rFonts w:ascii="Arial" w:hAnsi="Arial"/>
+                <w:b w:val="0"/>
+                <w:color w:val="000000"/>
+                <w:sz w:val="18"/>
+              </w:rPr>
+              <w:t>"/auth/callback". Returns "/".</w:t>
+            </w:r>
+          </w:p>
+        </w:tc>
+        <w:tc>
+          <w:tcPr>
+            <w:tcW w:type="dxa" w:w="4219"/>
+            <w:shd w:val="clear" w:fill="FFFFFF"/>
+            <w:tcMar>
+              <w:top w:w="75" w:type="dxa"/>
+              <w:left w:w="75" w:type="dxa"/>
+              <w:bottom w:w="75" w:type="dxa"/>
+              <w:right w:w="75" w:type="dxa"/>
+            </w:tcMar>
+            <w:vAlign w:val="center"/>
+          </w:tcPr>
+          <w:p>
+            <w:pPr>
+              <w:keepNext w:val="0"/>
+              <w:spacing w:after="0" w:line="250" w:lineRule="auto"/>
+            </w:pPr>
+            <w:r>
+              <w:rPr>
+                <w:rFonts w:ascii="Arial" w:hAnsi="Arial"/>
+                <w:b w:val="0"/>
+                <w:color w:val="000000"/>
+                <w:sz w:val="18"/>
+              </w:rPr>
+              <w:t>Pass; WB-S7 actual equals expected.</w:t>
+            </w:r>
+          </w:p>
+        </w:tc>
+      </w:tr>
+      <w:tr>
+        <w:trPr>
+          <w:cantSplit/>
+        </w:trPr>
+        <w:tc>
+          <w:tcPr>
+            <w:tcW w:type="dxa" w:w="792"/>
+            <w:shd w:val="clear" w:fill="FFFFFF"/>
+            <w:tcMar>
+              <w:top w:w="75" w:type="dxa"/>
+              <w:left w:w="75" w:type="dxa"/>
+              <w:bottom w:w="75" w:type="dxa"/>
+              <w:right w:w="75" w:type="dxa"/>
+            </w:tcMar>
+            <w:vAlign w:val="center"/>
+          </w:tcPr>
+          <w:p>
+            <w:pPr>
+              <w:keepNext w:val="0"/>
+              <w:spacing w:after="0" w:line="250" w:lineRule="auto"/>
+              <w:jc w:val="center"/>
+            </w:pPr>
+            <w:r>
+              <w:rPr>
+                <w:rFonts w:ascii="Arial" w:hAnsi="Arial"/>
+                <w:b w:val="0"/>
+                <w:color w:val="000000"/>
+                <w:sz w:val="18"/>
+              </w:rPr>
+              <w:t>S8</w:t>
+            </w:r>
+          </w:p>
+        </w:tc>
+        <w:tc>
+          <w:tcPr>
+            <w:tcW w:type="dxa" w:w="3744"/>
+            <w:shd w:val="clear" w:fill="FFFFFF"/>
+            <w:tcMar>
+              <w:top w:w="75" w:type="dxa"/>
+              <w:left w:w="75" w:type="dxa"/>
+              <w:bottom w:w="75" w:type="dxa"/>
+              <w:right w:w="75" w:type="dxa"/>
+            </w:tcMar>
+            <w:vAlign w:val="center"/>
+          </w:tcPr>
+          <w:p>
+            <w:pPr>
+              <w:keepNext w:val="0"/>
+              <w:spacing w:after="0" w:line="250" w:lineRule="auto"/>
+            </w:pPr>
+            <w:r>
+              <w:rPr>
+                <w:rFonts w:ascii="Arial" w:hAnsi="Arial"/>
+                <w:b w:val="0"/>
+                <w:color w:val="000000"/>
+                <w:sz w:val="18"/>
+              </w:rPr>
+              <w:t>S0 S1 S2 S3 S4 S5 S6 S7 S8 S10 S11</w:t>
+            </w:r>
+          </w:p>
+        </w:tc>
+        <w:tc>
+          <w:tcPr>
+            <w:tcW w:type="dxa" w:w="6336"/>
+            <w:shd w:val="clear" w:fill="FFFFFF"/>
+            <w:tcMar>
+              <w:top w:w="75" w:type="dxa"/>
+              <w:left w:w="75" w:type="dxa"/>
+              <w:bottom w:w="75" w:type="dxa"/>
+              <w:right w:w="75" w:type="dxa"/>
+            </w:tcMar>
+            <w:vAlign w:val="center"/>
+          </w:tcPr>
+          <w:p>
+            <w:pPr>
+              <w:keepNext w:val="0"/>
+              <w:spacing w:after="0" w:line="250" w:lineRule="auto"/>
+            </w:pPr>
+            <w:r>
+              <w:rPr>
+                <w:rFonts w:ascii="Arial" w:hAnsi="Arial"/>
+                <w:b w:val="0"/>
+                <w:color w:val="000000"/>
+                <w:sz w:val="18"/>
+              </w:rPr>
+              <w:t>"/groups?tab=mine". Returns "/groups?tab=mine".</w:t>
+            </w:r>
+          </w:p>
+        </w:tc>
+        <w:tc>
+          <w:tcPr>
+            <w:tcW w:type="dxa" w:w="4219"/>
+            <w:shd w:val="clear" w:fill="FFFFFF"/>
+            <w:tcMar>
+              <w:top w:w="75" w:type="dxa"/>
+              <w:left w:w="75" w:type="dxa"/>
+              <w:bottom w:w="75" w:type="dxa"/>
+              <w:right w:w="75" w:type="dxa"/>
+            </w:tcMar>
+            <w:vAlign w:val="center"/>
+          </w:tcPr>
+          <w:p>
+            <w:pPr>
+              <w:keepNext w:val="0"/>
+              <w:spacing w:after="0" w:line="250" w:lineRule="auto"/>
+            </w:pPr>
+            <w:r>
+              <w:rPr>
+                <w:rFonts w:ascii="Arial" w:hAnsi="Arial"/>
+                <w:b w:val="0"/>
+                <w:color w:val="000000"/>
+                <w:sz w:val="18"/>
+              </w:rPr>
+              <w:t>Pass; WB-S8 actual equals expected.</w:t>
+            </w:r>
+          </w:p>
+        </w:tc>
+      </w:tr>
+    </w:tbl>
+    <w:p>
+      <w:pPr>
+        <w:spacing w:after="20"/>
+      </w:pPr>
+    </w:p>
+    <w:p>
+      <w:r>
+        <w:rPr>
+          <w:b w:val="0"/>
+          <w:sz w:val="18"/>
+        </w:rPr>
+        <w:t>Each path adds at least one edge the earlier paths did not use, and together the eight paths use all 18 edges.</w:t>
+      </w:r>
+    </w:p>
+    <w:p>
+      <w:r>
+        <w:rPr>
+          <w:b w:val="0"/>
+          <w:sz w:val="18"/>
+        </w:rPr>
+        <w:t>S3 to S5 are the open-redirect defences: a crafted login link can never send a user to another site.</w:t>
+      </w:r>
+    </w:p>
+    <w:p>
+      <w:r>
+        <w:rPr>
+          <w:b w:val="0"/>
+          <w:sz w:val="18"/>
+        </w:rPr>
+        <w:t>Evidence: tests/lab4/auth-profile-basis-path.test.ts (describe "safeRedirectPath") and evidence/auth-profile-basis-path-observations.json.</w:t>
+      </w:r>
+    </w:p>
+    <w:p>
+      <w:r>
+        <w:br w:type="page"/>
+      </w:r>
+    </w:p>
+    <w:p>
+      <w:pPr>
+        <w:pStyle w:val="Heading1"/>
+      </w:pPr>
+      <w:r>
+        <w:t>White box testing UC1-03</w:t>
+      </w:r>
+    </w:p>
+    <w:p>
+      <w:pPr>
+        <w:pStyle w:val="Heading2"/>
+      </w:pPr>
+      <w:r>
+        <w:t>prepareProfileUpdate: the profile edit policy</w:t>
+      </w:r>
+    </w:p>
+    <w:p>
+      <w:r>
+        <w:rPr>
+          <w:b w:val="0"/>
+          <w:sz w:val="18"/>
+        </w:rPr>
+        <w:t>Source: domain/accounts/profile.ts:21-37</w:t>
+      </w:r>
+    </w:p>
+    <w:p>
+      <w:r>
+        <w:rPr>
+          <w:b w:val="0"/>
+          <w:sz w:val="19"/>
+        </w:rPr>
+        <w:t>Graph one call of prepareProfileUpdate, which UpdateProfile applies to every edit. The two operands of each AND are separate decisions. Each assertValidPreferences call is one decision ("no blank value"); its loop and the .every callbacks are outside the graph.</w:t>
+      </w:r>
+    </w:p>
+    <w:p>
+      <w:pPr>
+        <w:jc w:val="center"/>
+      </w:pPr>
+      <w:r>
+        <w:drawing>
+          <wp:inline xmlns:a="http://schemas.openxmlformats.org/drawingml/2006/main" xmlns:pic="http://schemas.openxmlformats.org/drawingml/2006/picture">
+            <wp:extent cx="9235440" cy="2022444"/>
+            <wp:docPr id="3" name="Picture 3" descr="prepare profile update cfg control flow graph"/>
+            <wp:cNvGraphicFramePr>
+              <a:graphicFrameLocks noChangeAspect="1"/>
+            </wp:cNvGraphicFramePr>
+            <a:graphic>
+              <a:graphicData uri="http://schemas.openxmlformats.org/drawingml/2006/picture">
+                <pic:pic>
+                  <pic:nvPicPr>
+                    <pic:cNvPr id="0" name="prepare-profile-update-cfg.png"/>
+                    <pic:cNvPicPr/>
+                  </pic:nvPicPr>
+                  <pic:blipFill>
+                    <a:blip r:embed="rId12"/>
+                    <a:stretch>
+                      <a:fillRect/>
+                    </a:stretch>
+                  </pic:blipFill>
+                  <pic:spPr>
+                    <a:xfrm>
+                      <a:off x="0" y="0"/>
+                      <a:ext cx="9235440" cy="2022444"/>
+                    </a:xfrm>
+                    <a:prstGeom prst="rect"/>
+                  </pic:spPr>
+                </pic:pic>
+              </a:graphicData>
+            </a:graphic>
+          </wp:inline>
+        </w:drawing>
+      </w:r>
+    </w:p>
+    <w:p>
+      <w:r>
+        <w:rPr>
+          <w:b/>
+          <w:sz w:val="20"/>
+        </w:rPr>
+        <w:t>Cyclomatic complexity V(G) = 22 - 14 + 2 = 10. Nine decisions (P1-P9) also give 9 + 1 = 10.</w:t>
+      </w:r>
+    </w:p>
+    <w:p>
+      <w:r>
+        <w:br w:type="page"/>
+      </w:r>
+    </w:p>
+    <w:p>
+      <w:pPr>
+        <w:pStyle w:val="Heading1"/>
+      </w:pPr>
+      <w:r>
+        <w:t>Basis paths for UC1-03</w:t>
+      </w:r>
+    </w:p>
+    <w:p>
+      <w:r>
+        <w:rPr>
+          <w:b/>
+          <w:sz w:val="22"/>
+        </w:rPr>
+        <w:t>prepareProfileUpdate: the profile edit policy</w:t>
+      </w:r>
+    </w:p>
+    <w:tbl>
+      <w:tblPr>
+        <w:tblW w:type="auto" w:w="0"/>
+        <w:jc w:val="center"/>
+        <w:tblBorders>
+          <w:top w:val="single" w:sz="4" w:color="D9D9D9"/>
+          <w:left w:val="single" w:sz="4" w:color="D9D9D9"/>
+          <w:bottom w:val="single" w:sz="4" w:color="D9D9D9"/>
+          <w:right w:val="single" w:sz="4" w:color="D9D9D9"/>
+          <w:insideH w:val="single" w:sz="4" w:color="D9D9D9"/>
+          <w:insideV w:val="single" w:sz="4" w:color="D9D9D9"/>
+        </w:tblBorders>
+        <w:tblLayout w:type="fixed"/>
+        <w:tblLook w:firstColumn="1" w:firstRow="1" w:lastColumn="0" w:lastRow="0" w:noHBand="0" w:noVBand="1" w:val="04A0"/>
+      </w:tblPr>
+      <w:tblGrid>
+        <w:gridCol w:w="792"/>
+        <w:gridCol w:w="3744"/>
+        <w:gridCol w:w="6336"/>
+        <w:gridCol w:w="4219"/>
+      </w:tblGrid>
+      <w:tr>
+        <w:trPr>
+          <w:cantSplit/>
+          <w:tblHeader/>
+        </w:trPr>
+        <w:tc>
+          <w:tcPr>
+            <w:tcW w:type="dxa" w:w="792"/>
+            <w:shd w:val="clear" w:fill="E7E7E7"/>
+            <w:tcMar>
+              <w:top w:w="75" w:type="dxa"/>
+              <w:left w:w="75" w:type="dxa"/>
+              <w:bottom w:w="75" w:type="dxa"/>
+              <w:right w:w="75" w:type="dxa"/>
+            </w:tcMar>
+            <w:vAlign w:val="center"/>
+          </w:tcPr>
+          <w:p>
+            <w:pPr>
+              <w:keepNext/>
+              <w:spacing w:after="0" w:line="250" w:lineRule="auto"/>
+              <w:jc w:val="center"/>
+            </w:pPr>
+            <w:r>
+              <w:rPr>
+                <w:rFonts w:ascii="Arial" w:hAnsi="Arial"/>
+                <w:b/>
+                <w:color w:val="000000"/>
+                <w:sz w:val="18"/>
+              </w:rPr>
+              <w:t>Path</w:t>
+            </w:r>
+          </w:p>
+        </w:tc>
+        <w:tc>
+          <w:tcPr>
+            <w:tcW w:type="dxa" w:w="3744"/>
+            <w:shd w:val="clear" w:fill="E7E7E7"/>
+            <w:tcMar>
+              <w:top w:w="75" w:type="dxa"/>
+              <w:left w:w="75" w:type="dxa"/>
+              <w:bottom w:w="75" w:type="dxa"/>
+              <w:right w:w="75" w:type="dxa"/>
+            </w:tcMar>
+            <w:vAlign w:val="center"/>
+          </w:tcPr>
+          <w:p>
+            <w:pPr>
+              <w:keepNext/>
+              <w:spacing w:after="0" w:line="250" w:lineRule="auto"/>
+            </w:pPr>
+            <w:r>
+              <w:rPr>
+                <w:rFonts w:ascii="Arial" w:hAnsi="Arial"/>
+                <w:b/>
+                <w:color w:val="000000"/>
+                <w:sz w:val="18"/>
+              </w:rPr>
+              <w:t>Basis set of nodes</w:t>
+            </w:r>
+          </w:p>
+        </w:tc>
+        <w:tc>
+          <w:tcPr>
+            <w:tcW w:type="dxa" w:w="6336"/>
+            <w:shd w:val="clear" w:fill="E7E7E7"/>
+            <w:tcMar>
+              <w:top w:w="75" w:type="dxa"/>
+              <w:left w:w="75" w:type="dxa"/>
+              <w:bottom w:w="75" w:type="dxa"/>
+              <w:right w:w="75" w:type="dxa"/>
+            </w:tcMar>
+            <w:vAlign w:val="center"/>
+          </w:tcPr>
+          <w:p>
+            <w:pPr>
+              <w:keepNext/>
+              <w:spacing w:after="0" w:line="250" w:lineRule="auto"/>
+            </w:pPr>
+            <w:r>
+              <w:rPr>
+                <w:rFonts w:ascii="Arial" w:hAnsi="Arial"/>
+                <w:b/>
+                <w:color w:val="000000"/>
+                <w:sz w:val="18"/>
+              </w:rPr>
+              <w:t>Input and expected output</w:t>
+            </w:r>
+          </w:p>
+        </w:tc>
+        <w:tc>
+          <w:tcPr>
+            <w:tcW w:type="dxa" w:w="4219"/>
+            <w:shd w:val="clear" w:fill="E7E7E7"/>
+            <w:tcMar>
+              <w:top w:w="75" w:type="dxa"/>
+              <w:left w:w="75" w:type="dxa"/>
+              <w:bottom w:w="75" w:type="dxa"/>
+              <w:right w:w="75" w:type="dxa"/>
+            </w:tcMar>
+            <w:vAlign w:val="center"/>
+          </w:tcPr>
+          <w:p>
+            <w:pPr>
+              <w:keepNext/>
+              <w:spacing w:after="0" w:line="250" w:lineRule="auto"/>
+            </w:pPr>
+            <w:r>
+              <w:rPr>
+                <w:rFonts w:ascii="Arial" w:hAnsi="Arial"/>
+                <w:b/>
+                <w:color w:val="000000"/>
+                <w:sz w:val="18"/>
+              </w:rPr>
+              <w:t>Execution evidence</w:t>
+            </w:r>
+          </w:p>
+        </w:tc>
+      </w:tr>
+      <w:tr>
+        <w:trPr>
+          <w:cantSplit/>
+        </w:trPr>
+        <w:tc>
+          <w:tcPr>
+            <w:tcW w:type="dxa" w:w="792"/>
+            <w:shd w:val="clear" w:fill="FFFFFF"/>
+            <w:tcMar>
+              <w:top w:w="75" w:type="dxa"/>
+              <w:left w:w="75" w:type="dxa"/>
+              <w:bottom w:w="75" w:type="dxa"/>
+              <w:right w:w="75" w:type="dxa"/>
+            </w:tcMar>
+            <w:vAlign w:val="center"/>
+          </w:tcPr>
+          <w:p>
+            <w:pPr>
+              <w:keepNext w:val="0"/>
+              <w:spacing w:after="0" w:line="250" w:lineRule="auto"/>
+              <w:jc w:val="center"/>
+            </w:pPr>
+            <w:r>
+              <w:rPr>
+                <w:rFonts w:ascii="Arial" w:hAnsi="Arial"/>
+                <w:b w:val="0"/>
+                <w:color w:val="000000"/>
+                <w:sz w:val="18"/>
+              </w:rPr>
+              <w:t>P1</w:t>
+            </w:r>
+          </w:p>
+        </w:tc>
+        <w:tc>
+          <w:tcPr>
+            <w:tcW w:type="dxa" w:w="3744"/>
+            <w:shd w:val="clear" w:fill="FFFFFF"/>
+            <w:tcMar>
+              <w:top w:w="75" w:type="dxa"/>
+              <w:left w:w="75" w:type="dxa"/>
+              <w:bottom w:w="75" w:type="dxa"/>
+              <w:right w:w="75" w:type="dxa"/>
+            </w:tcMar>
+            <w:vAlign w:val="center"/>
+          </w:tcPr>
+          <w:p>
+            <w:pPr>
+              <w:keepNext w:val="0"/>
+              <w:spacing w:after="0" w:line="250" w:lineRule="auto"/>
+            </w:pPr>
+            <w:r>
+              <w:rPr>
+                <w:rFonts w:ascii="Arial" w:hAnsi="Arial"/>
+                <w:b w:val="0"/>
+                <w:color w:val="000000"/>
+                <w:sz w:val="18"/>
+              </w:rPr>
+              <w:t>P0 P1 P11 P13</w:t>
+            </w:r>
+          </w:p>
+        </w:tc>
+        <w:tc>
+          <w:tcPr>
+            <w:tcW w:type="dxa" w:w="6336"/>
+            <w:shd w:val="clear" w:fill="FFFFFF"/>
+            <w:tcMar>
+              <w:top w:w="75" w:type="dxa"/>
+              <w:left w:w="75" w:type="dxa"/>
+              <w:bottom w:w="75" w:type="dxa"/>
+              <w:right w:w="75" w:type="dxa"/>
+            </w:tcMar>
+            <w:vAlign w:val="center"/>
+          </w:tcPr>
+          <w:p>
+            <w:pPr>
+              <w:keepNext w:val="0"/>
+              <w:spacing w:after="0" w:line="250" w:lineRule="auto"/>
+            </w:pPr>
+            <w:r>
+              <w:rPr>
+                <w:rFonts w:ascii="Arial" w:hAnsi="Arial"/>
+                <w:b w:val="0"/>
+                <w:color w:val="000000"/>
+                <w:sz w:val="18"/>
+              </w:rPr>
+              <w:t>Inactive account. INACTIVE_ACCOUNT.</w:t>
+            </w:r>
+          </w:p>
+        </w:tc>
+        <w:tc>
+          <w:tcPr>
+            <w:tcW w:type="dxa" w:w="4219"/>
+            <w:shd w:val="clear" w:fill="FFFFFF"/>
+            <w:tcMar>
+              <w:top w:w="75" w:type="dxa"/>
+              <w:left w:w="75" w:type="dxa"/>
+              <w:bottom w:w="75" w:type="dxa"/>
+              <w:right w:w="75" w:type="dxa"/>
+            </w:tcMar>
+            <w:vAlign w:val="center"/>
+          </w:tcPr>
+          <w:p>
+            <w:pPr>
+              <w:keepNext w:val="0"/>
+              <w:spacing w:after="0" w:line="250" w:lineRule="auto"/>
+            </w:pPr>
+            <w:r>
+              <w:rPr>
+                <w:rFonts w:ascii="Arial" w:hAnsi="Arial"/>
+                <w:b w:val="0"/>
+                <w:color w:val="000000"/>
+                <w:sz w:val="18"/>
+              </w:rPr>
+              <w:t>Pass; WB-P1 actual equals expected.</w:t>
+            </w:r>
+          </w:p>
+        </w:tc>
+      </w:tr>
+      <w:tr>
+        <w:trPr>
+          <w:cantSplit/>
+        </w:trPr>
+        <w:tc>
+          <w:tcPr>
+            <w:tcW w:type="dxa" w:w="792"/>
+            <w:shd w:val="clear" w:fill="FFFFFF"/>
+            <w:tcMar>
+              <w:top w:w="75" w:type="dxa"/>
+              <w:left w:w="75" w:type="dxa"/>
+              <w:bottom w:w="75" w:type="dxa"/>
+              <w:right w:w="75" w:type="dxa"/>
+            </w:tcMar>
+            <w:vAlign w:val="center"/>
+          </w:tcPr>
+          <w:p>
+            <w:pPr>
+              <w:keepNext w:val="0"/>
+              <w:spacing w:after="0" w:line="250" w:lineRule="auto"/>
+              <w:jc w:val="center"/>
+            </w:pPr>
+            <w:r>
+              <w:rPr>
+                <w:rFonts w:ascii="Arial" w:hAnsi="Arial"/>
+                <w:b w:val="0"/>
+                <w:color w:val="000000"/>
+                <w:sz w:val="18"/>
+              </w:rPr>
+              <w:t>P2</w:t>
+            </w:r>
+          </w:p>
+        </w:tc>
+        <w:tc>
+          <w:tcPr>
+            <w:tcW w:type="dxa" w:w="3744"/>
+            <w:shd w:val="clear" w:fill="FFFFFF"/>
+            <w:tcMar>
+              <w:top w:w="75" w:type="dxa"/>
+              <w:left w:w="75" w:type="dxa"/>
+              <w:bottom w:w="75" w:type="dxa"/>
+              <w:right w:w="75" w:type="dxa"/>
+            </w:tcMar>
+            <w:vAlign w:val="center"/>
+          </w:tcPr>
+          <w:p>
+            <w:pPr>
+              <w:keepNext w:val="0"/>
+              <w:spacing w:after="0" w:line="250" w:lineRule="auto"/>
+            </w:pPr>
+            <w:r>
+              <w:rPr>
+                <w:rFonts w:ascii="Arial" w:hAnsi="Arial"/>
+                <w:b w:val="0"/>
+                <w:color w:val="000000"/>
+                <w:sz w:val="18"/>
+              </w:rPr>
+              <w:t>P0 P1 P2 P12 P13</w:t>
+            </w:r>
+          </w:p>
+        </w:tc>
+        <w:tc>
+          <w:tcPr>
+            <w:tcW w:type="dxa" w:w="6336"/>
+            <w:shd w:val="clear" w:fill="FFFFFF"/>
+            <w:tcMar>
+              <w:top w:w="75" w:type="dxa"/>
+              <w:left w:w="75" w:type="dxa"/>
+              <w:bottom w:w="75" w:type="dxa"/>
+              <w:right w:w="75" w:type="dxa"/>
+            </w:tcMar>
+            <w:vAlign w:val="center"/>
+          </w:tcPr>
+          <w:p>
+            <w:pPr>
+              <w:keepNext w:val="0"/>
+              <w:spacing w:after="0" w:line="250" w:lineRule="auto"/>
+            </w:pPr>
+            <w:r>
+              <w:rPr>
+                <w:rFonts w:ascii="Arial" w:hAnsi="Arial"/>
+                <w:b w:val="0"/>
+                <w:color w:val="000000"/>
+                <w:sz w:val="18"/>
+              </w:rPr>
+              <w:t>Name of spaces only. INVALID_INPUT: name must be 1-60 characters.</w:t>
+            </w:r>
+          </w:p>
+        </w:tc>
+        <w:tc>
+          <w:tcPr>
+            <w:tcW w:type="dxa" w:w="4219"/>
+            <w:shd w:val="clear" w:fill="FFFFFF"/>
+            <w:tcMar>
+              <w:top w:w="75" w:type="dxa"/>
+              <w:left w:w="75" w:type="dxa"/>
+              <w:bottom w:w="75" w:type="dxa"/>
+              <w:right w:w="75" w:type="dxa"/>
+            </w:tcMar>
+            <w:vAlign w:val="center"/>
+          </w:tcPr>
+          <w:p>
+            <w:pPr>
+              <w:keepNext w:val="0"/>
+              <w:spacing w:after="0" w:line="250" w:lineRule="auto"/>
+            </w:pPr>
+            <w:r>
+              <w:rPr>
+                <w:rFonts w:ascii="Arial" w:hAnsi="Arial"/>
+                <w:b w:val="0"/>
+                <w:color w:val="000000"/>
+                <w:sz w:val="18"/>
+              </w:rPr>
+              <w:t>Pass; WB-P2 actual equals expected.</w:t>
+            </w:r>
+          </w:p>
+        </w:tc>
+      </w:tr>
+      <w:tr>
+        <w:trPr>
+          <w:cantSplit/>
+        </w:trPr>
+        <w:tc>
+          <w:tcPr>
+            <w:tcW w:type="dxa" w:w="792"/>
+            <w:shd w:val="clear" w:fill="FFFFFF"/>
+            <w:tcMar>
+              <w:top w:w="75" w:type="dxa"/>
+              <w:left w:w="75" w:type="dxa"/>
+              <w:bottom w:w="75" w:type="dxa"/>
+              <w:right w:w="75" w:type="dxa"/>
+            </w:tcMar>
+            <w:vAlign w:val="center"/>
+          </w:tcPr>
+          <w:p>
+            <w:pPr>
+              <w:keepNext w:val="0"/>
+              <w:spacing w:after="0" w:line="250" w:lineRule="auto"/>
+              <w:jc w:val="center"/>
+            </w:pPr>
+            <w:r>
+              <w:rPr>
+                <w:rFonts w:ascii="Arial" w:hAnsi="Arial"/>
+                <w:b w:val="0"/>
+                <w:color w:val="000000"/>
+                <w:sz w:val="18"/>
+              </w:rPr>
+              <w:t>P3</w:t>
+            </w:r>
+          </w:p>
+        </w:tc>
+        <w:tc>
+          <w:tcPr>
+            <w:tcW w:type="dxa" w:w="3744"/>
+            <w:shd w:val="clear" w:fill="FFFFFF"/>
+            <w:tcMar>
+              <w:top w:w="75" w:type="dxa"/>
+              <w:left w:w="75" w:type="dxa"/>
+              <w:bottom w:w="75" w:type="dxa"/>
+              <w:right w:w="75" w:type="dxa"/>
+            </w:tcMar>
+            <w:vAlign w:val="center"/>
+          </w:tcPr>
+          <w:p>
+            <w:pPr>
+              <w:keepNext w:val="0"/>
+              <w:spacing w:after="0" w:line="250" w:lineRule="auto"/>
+            </w:pPr>
+            <w:r>
+              <w:rPr>
+                <w:rFonts w:ascii="Arial" w:hAnsi="Arial"/>
+                <w:b w:val="0"/>
+                <w:color w:val="000000"/>
+                <w:sz w:val="18"/>
+              </w:rPr>
+              <w:t>P0 P1 P2 P3 P12 P13</w:t>
+            </w:r>
+          </w:p>
+        </w:tc>
+        <w:tc>
+          <w:tcPr>
+            <w:tcW w:type="dxa" w:w="6336"/>
+            <w:shd w:val="clear" w:fill="FFFFFF"/>
+            <w:tcMar>
+              <w:top w:w="75" w:type="dxa"/>
+              <w:left w:w="75" w:type="dxa"/>
+              <w:bottom w:w="75" w:type="dxa"/>
+              <w:right w:w="75" w:type="dxa"/>
+            </w:tcMar>
+            <w:vAlign w:val="center"/>
+          </w:tcPr>
+          <w:p>
+            <w:pPr>
+              <w:keepNext w:val="0"/>
+              <w:spacing w:after="0" w:line="250" w:lineRule="auto"/>
+            </w:pPr>
+            <w:r>
+              <w:rPr>
+                <w:rFonts w:ascii="Arial" w:hAnsi="Arial"/>
+                <w:b w:val="0"/>
+                <w:color w:val="000000"/>
+                <w:sz w:val="18"/>
+              </w:rPr>
+              <w:t>Name of 61 characters. INVALID_INPUT: name must be 1-60 characters.</w:t>
+            </w:r>
+          </w:p>
+        </w:tc>
+        <w:tc>
+          <w:tcPr>
+            <w:tcW w:type="dxa" w:w="4219"/>
+            <w:shd w:val="clear" w:fill="FFFFFF"/>
+            <w:tcMar>
+              <w:top w:w="75" w:type="dxa"/>
+              <w:left w:w="75" w:type="dxa"/>
+              <w:bottom w:w="75" w:type="dxa"/>
+              <w:right w:w="75" w:type="dxa"/>
+            </w:tcMar>
+            <w:vAlign w:val="center"/>
+          </w:tcPr>
+          <w:p>
+            <w:pPr>
+              <w:keepNext w:val="0"/>
+              <w:spacing w:after="0" w:line="250" w:lineRule="auto"/>
+            </w:pPr>
+            <w:r>
+              <w:rPr>
+                <w:rFonts w:ascii="Arial" w:hAnsi="Arial"/>
+                <w:b w:val="0"/>
+                <w:color w:val="000000"/>
+                <w:sz w:val="18"/>
+              </w:rPr>
+              <w:t>Pass; WB-P3 actual equals expected.</w:t>
+            </w:r>
+          </w:p>
+        </w:tc>
+      </w:tr>
+      <w:tr>
+        <w:trPr>
+          <w:cantSplit/>
+        </w:trPr>
+        <w:tc>
+          <w:tcPr>
+            <w:tcW w:type="dxa" w:w="792"/>
+            <w:shd w:val="clear" w:fill="FFFFFF"/>
+            <w:tcMar>
+              <w:top w:w="75" w:type="dxa"/>
+              <w:left w:w="75" w:type="dxa"/>
+              <w:bottom w:w="75" w:type="dxa"/>
+              <w:right w:w="75" w:type="dxa"/>
+            </w:tcMar>
+            <w:vAlign w:val="center"/>
+          </w:tcPr>
+          <w:p>
+            <w:pPr>
+              <w:keepNext w:val="0"/>
+              <w:spacing w:after="0" w:line="250" w:lineRule="auto"/>
+              <w:jc w:val="center"/>
+            </w:pPr>
+            <w:r>
+              <w:rPr>
+                <w:rFonts w:ascii="Arial" w:hAnsi="Arial"/>
+                <w:b w:val="0"/>
+                <w:color w:val="000000"/>
+                <w:sz w:val="18"/>
+              </w:rPr>
+              <w:t>P4</w:t>
+            </w:r>
+          </w:p>
+        </w:tc>
+        <w:tc>
+          <w:tcPr>
+            <w:tcW w:type="dxa" w:w="3744"/>
+            <w:shd w:val="clear" w:fill="FFFFFF"/>
+            <w:tcMar>
+              <w:top w:w="75" w:type="dxa"/>
+              <w:left w:w="75" w:type="dxa"/>
+              <w:bottom w:w="75" w:type="dxa"/>
+              <w:right w:w="75" w:type="dxa"/>
+            </w:tcMar>
+            <w:vAlign w:val="center"/>
+          </w:tcPr>
+          <w:p>
+            <w:pPr>
+              <w:keepNext w:val="0"/>
+              <w:spacing w:after="0" w:line="250" w:lineRule="auto"/>
+            </w:pPr>
+            <w:r>
+              <w:rPr>
+                <w:rFonts w:ascii="Arial" w:hAnsi="Arial"/>
+                <w:b w:val="0"/>
+                <w:color w:val="000000"/>
+                <w:sz w:val="18"/>
+              </w:rPr>
+              <w:t>P0 P1 P2 P3 P4 P12 P13</w:t>
+            </w:r>
+          </w:p>
+        </w:tc>
+        <w:tc>
+          <w:tcPr>
+            <w:tcW w:type="dxa" w:w="6336"/>
+            <w:shd w:val="clear" w:fill="FFFFFF"/>
+            <w:tcMar>
+              <w:top w:w="75" w:type="dxa"/>
+              <w:left w:w="75" w:type="dxa"/>
+              <w:bottom w:w="75" w:type="dxa"/>
+              <w:right w:w="75" w:type="dxa"/>
+            </w:tcMar>
+            <w:vAlign w:val="center"/>
+          </w:tcPr>
+          <w:p>
+            <w:pPr>
+              <w:keepNext w:val="0"/>
+              <w:spacing w:after="0" w:line="250" w:lineRule="auto"/>
+            </w:pPr>
+            <w:r>
+              <w:rPr>
+                <w:rFonts w:ascii="Arial" w:hAnsi="Arial"/>
+                <w:b w:val="0"/>
+                <w:color w:val="000000"/>
+                <w:sz w:val="18"/>
+              </w:rPr>
+              <w:t>Sports [" "]. INVALID_INPUT: preferredSports contains an empty value.</w:t>
+            </w:r>
+          </w:p>
+        </w:tc>
+        <w:tc>
+          <w:tcPr>
+            <w:tcW w:type="dxa" w:w="4219"/>
+            <w:shd w:val="clear" w:fill="FFFFFF"/>
+            <w:tcMar>
+              <w:top w:w="75" w:type="dxa"/>
+              <w:left w:w="75" w:type="dxa"/>
+              <w:bottom w:w="75" w:type="dxa"/>
+              <w:right w:w="75" w:type="dxa"/>
+            </w:tcMar>
+            <w:vAlign w:val="center"/>
+          </w:tcPr>
+          <w:p>
+            <w:pPr>
+              <w:keepNext w:val="0"/>
+              <w:spacing w:after="0" w:line="250" w:lineRule="auto"/>
+            </w:pPr>
+            <w:r>
+              <w:rPr>
+                <w:rFonts w:ascii="Arial" w:hAnsi="Arial"/>
+                <w:b w:val="0"/>
+                <w:color w:val="000000"/>
+                <w:sz w:val="18"/>
+              </w:rPr>
+              <w:t>Pass; WB-P4 actual equals expected.</w:t>
+            </w:r>
+          </w:p>
+        </w:tc>
+      </w:tr>
+      <w:tr>
+        <w:trPr>
+          <w:cantSplit/>
+        </w:trPr>
+        <w:tc>
+          <w:tcPr>
+            <w:tcW w:type="dxa" w:w="792"/>
+            <w:shd w:val="clear" w:fill="FFFFFF"/>
+            <w:tcMar>
+              <w:top w:w="75" w:type="dxa"/>
+              <w:left w:w="75" w:type="dxa"/>
+              <w:bottom w:w="75" w:type="dxa"/>
+              <w:right w:w="75" w:type="dxa"/>
+            </w:tcMar>
+            <w:vAlign w:val="center"/>
+          </w:tcPr>
+          <w:p>
+            <w:pPr>
+              <w:keepNext w:val="0"/>
+              <w:spacing w:after="0" w:line="250" w:lineRule="auto"/>
+              <w:jc w:val="center"/>
+            </w:pPr>
+            <w:r>
+              <w:rPr>
+                <w:rFonts w:ascii="Arial" w:hAnsi="Arial"/>
+                <w:b w:val="0"/>
+                <w:color w:val="000000"/>
+                <w:sz w:val="18"/>
+              </w:rPr>
+              <w:t>P5</w:t>
+            </w:r>
+          </w:p>
+        </w:tc>
+        <w:tc>
+          <w:tcPr>
+            <w:tcW w:type="dxa" w:w="3744"/>
+            <w:shd w:val="clear" w:fill="FFFFFF"/>
+            <w:tcMar>
+              <w:top w:w="75" w:type="dxa"/>
+              <w:left w:w="75" w:type="dxa"/>
+              <w:bottom w:w="75" w:type="dxa"/>
+              <w:right w:w="75" w:type="dxa"/>
+            </w:tcMar>
+            <w:vAlign w:val="center"/>
+          </w:tcPr>
+          <w:p>
+            <w:pPr>
+              <w:keepNext w:val="0"/>
+              <w:spacing w:after="0" w:line="250" w:lineRule="auto"/>
+            </w:pPr>
+            <w:r>
+              <w:rPr>
+                <w:rFonts w:ascii="Arial" w:hAnsi="Arial"/>
+                <w:b w:val="0"/>
+                <w:color w:val="000000"/>
+                <w:sz w:val="18"/>
+              </w:rPr>
+              <w:t>P0 P1 P2 P3 P4 P5 P12 P13</w:t>
+            </w:r>
+          </w:p>
+        </w:tc>
+        <w:tc>
+          <w:tcPr>
+            <w:tcW w:type="dxa" w:w="6336"/>
+            <w:shd w:val="clear" w:fill="FFFFFF"/>
+            <w:tcMar>
+              <w:top w:w="75" w:type="dxa"/>
+              <w:left w:w="75" w:type="dxa"/>
+              <w:bottom w:w="75" w:type="dxa"/>
+              <w:right w:w="75" w:type="dxa"/>
+            </w:tcMar>
+            <w:vAlign w:val="center"/>
+          </w:tcPr>
+          <w:p>
+            <w:pPr>
+              <w:keepNext w:val="0"/>
+              <w:spacing w:after="0" w:line="250" w:lineRule="auto"/>
+            </w:pPr>
+            <w:r>
+              <w:rPr>
+                <w:rFonts w:ascii="Arial" w:hAnsi="Arial"/>
+                <w:b w:val="0"/>
+                <w:color w:val="000000"/>
+                <w:sz w:val="18"/>
+              </w:rPr>
+              <w:t>Regions [" "]. INVALID_INPUT: preferredRegions contains an empty value.</w:t>
+            </w:r>
+          </w:p>
+        </w:tc>
+        <w:tc>
+          <w:tcPr>
+            <w:tcW w:type="dxa" w:w="4219"/>
+            <w:shd w:val="clear" w:fill="FFFFFF"/>
+            <w:tcMar>
+              <w:top w:w="75" w:type="dxa"/>
+              <w:left w:w="75" w:type="dxa"/>
+              <w:bottom w:w="75" w:type="dxa"/>
+              <w:right w:w="75" w:type="dxa"/>
+            </w:tcMar>
+            <w:vAlign w:val="center"/>
+          </w:tcPr>
+          <w:p>
+            <w:pPr>
+              <w:keepNext w:val="0"/>
+              <w:spacing w:after="0" w:line="250" w:lineRule="auto"/>
+            </w:pPr>
+            <w:r>
+              <w:rPr>
+                <w:rFonts w:ascii="Arial" w:hAnsi="Arial"/>
+                <w:b w:val="0"/>
+                <w:color w:val="000000"/>
+                <w:sz w:val="18"/>
+              </w:rPr>
+              <w:t>Pass; WB-P5 actual equals expected.</w:t>
+            </w:r>
+          </w:p>
+        </w:tc>
+      </w:tr>
+      <w:tr>
+        <w:trPr>
+          <w:cantSplit/>
+        </w:trPr>
+        <w:tc>
+          <w:tcPr>
+            <w:tcW w:type="dxa" w:w="792"/>
+            <w:shd w:val="clear" w:fill="FFFFFF"/>
+            <w:tcMar>
+              <w:top w:w="75" w:type="dxa"/>
+              <w:left w:w="75" w:type="dxa"/>
+              <w:bottom w:w="75" w:type="dxa"/>
+              <w:right w:w="75" w:type="dxa"/>
+            </w:tcMar>
+            <w:vAlign w:val="center"/>
+          </w:tcPr>
+          <w:p>
+            <w:pPr>
+              <w:keepNext w:val="0"/>
+              <w:spacing w:after="0" w:line="250" w:lineRule="auto"/>
+              <w:jc w:val="center"/>
+            </w:pPr>
+            <w:r>
+              <w:rPr>
+                <w:rFonts w:ascii="Arial" w:hAnsi="Arial"/>
+                <w:b w:val="0"/>
+                <w:color w:val="000000"/>
+                <w:sz w:val="18"/>
+              </w:rPr>
+              <w:t>P6</w:t>
+            </w:r>
+          </w:p>
+        </w:tc>
+        <w:tc>
+          <w:tcPr>
+            <w:tcW w:type="dxa" w:w="3744"/>
+            <w:shd w:val="clear" w:fill="FFFFFF"/>
+            <w:tcMar>
+              <w:top w:w="75" w:type="dxa"/>
+              <w:left w:w="75" w:type="dxa"/>
+              <w:bottom w:w="75" w:type="dxa"/>
+              <w:right w:w="75" w:type="dxa"/>
+            </w:tcMar>
+            <w:vAlign w:val="center"/>
+          </w:tcPr>
+          <w:p>
+            <w:pPr>
+              <w:keepNext w:val="0"/>
+              <w:spacing w:after="0" w:line="250" w:lineRule="auto"/>
+            </w:pPr>
+            <w:r>
+              <w:rPr>
+                <w:rFonts w:ascii="Arial" w:hAnsi="Arial"/>
+                <w:b w:val="0"/>
+                <w:color w:val="000000"/>
+                <w:sz w:val="18"/>
+              </w:rPr>
+              <w:t>P0 P1 P2 P3 P4 P5 P6 P12 P13</w:t>
+            </w:r>
+          </w:p>
+        </w:tc>
+        <w:tc>
+          <w:tcPr>
+            <w:tcW w:type="dxa" w:w="6336"/>
+            <w:shd w:val="clear" w:fill="FFFFFF"/>
+            <w:tcMar>
+              <w:top w:w="75" w:type="dxa"/>
+              <w:left w:w="75" w:type="dxa"/>
+              <w:bottom w:w="75" w:type="dxa"/>
+              <w:right w:w="75" w:type="dxa"/>
+            </w:tcMar>
+            <w:vAlign w:val="center"/>
+          </w:tcPr>
+          <w:p>
+            <w:pPr>
+              <w:keepNext w:val="0"/>
+              <w:spacing w:after="0" w:line="250" w:lineRule="auto"/>
+            </w:pPr>
+            <w:r>
+              <w:rPr>
+                <w:rFonts w:ascii="Arial" w:hAnsi="Arial"/>
+                <w:b w:val="0"/>
+                <w:color w:val="000000"/>
+                <w:sz w:val="18"/>
+              </w:rPr>
+              <w:t>No sports. INVALID_INPUT: choose at least one supported sport.</w:t>
+            </w:r>
+          </w:p>
+        </w:tc>
+        <w:tc>
+          <w:tcPr>
+            <w:tcW w:type="dxa" w:w="4219"/>
+            <w:shd w:val="clear" w:fill="FFFFFF"/>
+            <w:tcMar>
+              <w:top w:w="75" w:type="dxa"/>
+              <w:left w:w="75" w:type="dxa"/>
+              <w:bottom w:w="75" w:type="dxa"/>
+              <w:right w:w="75" w:type="dxa"/>
+            </w:tcMar>
+            <w:vAlign w:val="center"/>
+          </w:tcPr>
+          <w:p>
+            <w:pPr>
+              <w:keepNext w:val="0"/>
+              <w:spacing w:after="0" w:line="250" w:lineRule="auto"/>
+            </w:pPr>
+            <w:r>
+              <w:rPr>
+                <w:rFonts w:ascii="Arial" w:hAnsi="Arial"/>
+                <w:b w:val="0"/>
+                <w:color w:val="000000"/>
+                <w:sz w:val="18"/>
+              </w:rPr>
+              <w:t>Pass; WB-P6 actual equals expected.</w:t>
+            </w:r>
+          </w:p>
+        </w:tc>
+      </w:tr>
+      <w:tr>
+        <w:trPr>
+          <w:cantSplit/>
+        </w:trPr>
+        <w:tc>
+          <w:tcPr>
+            <w:tcW w:type="dxa" w:w="792"/>
+            <w:shd w:val="clear" w:fill="FFFFFF"/>
+            <w:tcMar>
+              <w:top w:w="75" w:type="dxa"/>
+              <w:left w:w="75" w:type="dxa"/>
+              <w:bottom w:w="75" w:type="dxa"/>
+              <w:right w:w="75" w:type="dxa"/>
+            </w:tcMar>
+            <w:vAlign w:val="center"/>
+          </w:tcPr>
+          <w:p>
+            <w:pPr>
+              <w:keepNext w:val="0"/>
+              <w:spacing w:after="0" w:line="250" w:lineRule="auto"/>
+              <w:jc w:val="center"/>
+            </w:pPr>
+            <w:r>
+              <w:rPr>
+                <w:rFonts w:ascii="Arial" w:hAnsi="Arial"/>
+                <w:b w:val="0"/>
+                <w:color w:val="000000"/>
+                <w:sz w:val="18"/>
+              </w:rPr>
+              <w:t>P7</w:t>
+            </w:r>
+          </w:p>
+        </w:tc>
+        <w:tc>
+          <w:tcPr>
+            <w:tcW w:type="dxa" w:w="3744"/>
+            <w:shd w:val="clear" w:fill="FFFFFF"/>
+            <w:tcMar>
+              <w:top w:w="75" w:type="dxa"/>
+              <w:left w:w="75" w:type="dxa"/>
+              <w:bottom w:w="75" w:type="dxa"/>
+              <w:right w:w="75" w:type="dxa"/>
+            </w:tcMar>
+            <w:vAlign w:val="center"/>
+          </w:tcPr>
+          <w:p>
+            <w:pPr>
+              <w:keepNext w:val="0"/>
+              <w:spacing w:after="0" w:line="250" w:lineRule="auto"/>
+            </w:pPr>
+            <w:r>
+              <w:rPr>
+                <w:rFonts w:ascii="Arial" w:hAnsi="Arial"/>
+                <w:b w:val="0"/>
+                <w:color w:val="000000"/>
+                <w:sz w:val="18"/>
+              </w:rPr>
+              <w:t>P0 P1 P2 P3 P4 P5 P6 P7 P12 P13</w:t>
+            </w:r>
+          </w:p>
+        </w:tc>
+        <w:tc>
+          <w:tcPr>
+            <w:tcW w:type="dxa" w:w="6336"/>
+            <w:shd w:val="clear" w:fill="FFFFFF"/>
+            <w:tcMar>
+              <w:top w:w="75" w:type="dxa"/>
+              <w:left w:w="75" w:type="dxa"/>
+              <w:bottom w:w="75" w:type="dxa"/>
+              <w:right w:w="75" w:type="dxa"/>
+            </w:tcMar>
+            <w:vAlign w:val="center"/>
+          </w:tcPr>
+          <w:p>
+            <w:pPr>
+              <w:keepNext w:val="0"/>
+              <w:spacing w:after="0" w:line="250" w:lineRule="auto"/>
+            </w:pPr>
+            <w:r>
+              <w:rPr>
+                <w:rFonts w:ascii="Arial" w:hAnsi="Arial"/>
+                <w:b w:val="0"/>
+                <w:color w:val="000000"/>
+                <w:sz w:val="18"/>
+              </w:rPr>
+              <w:t>Sports ["Golf"]. INVALID_INPUT: choose at least one supported sport.</w:t>
+            </w:r>
+          </w:p>
+        </w:tc>
+        <w:tc>
+          <w:tcPr>
+            <w:tcW w:type="dxa" w:w="4219"/>
+            <w:shd w:val="clear" w:fill="FFFFFF"/>
+            <w:tcMar>
+              <w:top w:w="75" w:type="dxa"/>
+              <w:left w:w="75" w:type="dxa"/>
+              <w:bottom w:w="75" w:type="dxa"/>
+              <w:right w:w="75" w:type="dxa"/>
+            </w:tcMar>
+            <w:vAlign w:val="center"/>
+          </w:tcPr>
+          <w:p>
+            <w:pPr>
+              <w:keepNext w:val="0"/>
+              <w:spacing w:after="0" w:line="250" w:lineRule="auto"/>
+            </w:pPr>
+            <w:r>
+              <w:rPr>
+                <w:rFonts w:ascii="Arial" w:hAnsi="Arial"/>
+                <w:b w:val="0"/>
+                <w:color w:val="000000"/>
+                <w:sz w:val="18"/>
+              </w:rPr>
+              <w:t>Pass; WB-P7 actual equals expected.</w:t>
+            </w:r>
+          </w:p>
+        </w:tc>
+      </w:tr>
+      <w:tr>
+        <w:trPr>
+          <w:cantSplit/>
+        </w:trPr>
+        <w:tc>
+          <w:tcPr>
+            <w:tcW w:type="dxa" w:w="792"/>
+            <w:shd w:val="clear" w:fill="FFFFFF"/>
+            <w:tcMar>
+              <w:top w:w="75" w:type="dxa"/>
+              <w:left w:w="75" w:type="dxa"/>
+              <w:bottom w:w="75" w:type="dxa"/>
+              <w:right w:w="75" w:type="dxa"/>
+            </w:tcMar>
+            <w:vAlign w:val="center"/>
+          </w:tcPr>
+          <w:p>
+            <w:pPr>
+              <w:keepNext w:val="0"/>
+              <w:spacing w:after="0" w:line="250" w:lineRule="auto"/>
+              <w:jc w:val="center"/>
+            </w:pPr>
+            <w:r>
+              <w:rPr>
+                <w:rFonts w:ascii="Arial" w:hAnsi="Arial"/>
+                <w:b w:val="0"/>
+                <w:color w:val="000000"/>
+                <w:sz w:val="18"/>
+              </w:rPr>
+              <w:t>P8</w:t>
+            </w:r>
+          </w:p>
+        </w:tc>
+        <w:tc>
+          <w:tcPr>
+            <w:tcW w:type="dxa" w:w="3744"/>
+            <w:shd w:val="clear" w:fill="FFFFFF"/>
+            <w:tcMar>
+              <w:top w:w="75" w:type="dxa"/>
+              <w:left w:w="75" w:type="dxa"/>
+              <w:bottom w:w="75" w:type="dxa"/>
+              <w:right w:w="75" w:type="dxa"/>
+            </w:tcMar>
+            <w:vAlign w:val="center"/>
+          </w:tcPr>
+          <w:p>
+            <w:pPr>
+              <w:keepNext w:val="0"/>
+              <w:spacing w:after="0" w:line="250" w:lineRule="auto"/>
+            </w:pPr>
+            <w:r>
+              <w:rPr>
+                <w:rFonts w:ascii="Arial" w:hAnsi="Arial"/>
+                <w:b w:val="0"/>
+                <w:color w:val="000000"/>
+                <w:sz w:val="18"/>
+              </w:rPr>
+              <w:t>P0 P1 P2 P3 P4 P5 P6 P7 P8 P12 P13</w:t>
+            </w:r>
+          </w:p>
+        </w:tc>
+        <w:tc>
+          <w:tcPr>
+            <w:tcW w:type="dxa" w:w="6336"/>
+            <w:shd w:val="clear" w:fill="FFFFFF"/>
+            <w:tcMar>
+              <w:top w:w="75" w:type="dxa"/>
+              <w:left w:w="75" w:type="dxa"/>
+              <w:bottom w:w="75" w:type="dxa"/>
+              <w:right w:w="75" w:type="dxa"/>
+            </w:tcMar>
+            <w:vAlign w:val="center"/>
+          </w:tcPr>
+          <w:p>
+            <w:pPr>
+              <w:keepNext w:val="0"/>
+              <w:spacing w:after="0" w:line="250" w:lineRule="auto"/>
+            </w:pPr>
+            <w:r>
+              <w:rPr>
+                <w:rFonts w:ascii="Arial" w:hAnsi="Arial"/>
+                <w:b w:val="0"/>
+                <w:color w:val="000000"/>
+                <w:sz w:val="18"/>
+              </w:rPr>
+              <w:t>No regions. INVALID_INPUT: choose at least one supported region.</w:t>
+            </w:r>
+          </w:p>
+        </w:tc>
+        <w:tc>
+          <w:tcPr>
+            <w:tcW w:type="dxa" w:w="4219"/>
+            <w:shd w:val="clear" w:fill="FFFFFF"/>
+            <w:tcMar>
+              <w:top w:w="75" w:type="dxa"/>
+              <w:left w:w="75" w:type="dxa"/>
+              <w:bottom w:w="75" w:type="dxa"/>
+              <w:right w:w="75" w:type="dxa"/>
+            </w:tcMar>
+            <w:vAlign w:val="center"/>
+          </w:tcPr>
+          <w:p>
+            <w:pPr>
+              <w:keepNext w:val="0"/>
+              <w:spacing w:after="0" w:line="250" w:lineRule="auto"/>
+            </w:pPr>
+            <w:r>
+              <w:rPr>
+                <w:rFonts w:ascii="Arial" w:hAnsi="Arial"/>
+                <w:b w:val="0"/>
+                <w:color w:val="000000"/>
+                <w:sz w:val="18"/>
+              </w:rPr>
+              <w:t>Pass; WB-P8 actual equals expected.</w:t>
+            </w:r>
+          </w:p>
+        </w:tc>
+      </w:tr>
+      <w:tr>
+        <w:trPr>
+          <w:cantSplit/>
+        </w:trPr>
+        <w:tc>
+          <w:tcPr>
+            <w:tcW w:type="dxa" w:w="792"/>
+            <w:shd w:val="clear" w:fill="FFFFFF"/>
+            <w:tcMar>
+              <w:top w:w="75" w:type="dxa"/>
+              <w:left w:w="75" w:type="dxa"/>
+              <w:bottom w:w="75" w:type="dxa"/>
+              <w:right w:w="75" w:type="dxa"/>
+            </w:tcMar>
+            <w:vAlign w:val="center"/>
+          </w:tcPr>
+          <w:p>
+            <w:pPr>
+              <w:keepNext w:val="0"/>
+              <w:spacing w:after="0" w:line="250" w:lineRule="auto"/>
+              <w:jc w:val="center"/>
+            </w:pPr>
+            <w:r>
+              <w:rPr>
+                <w:rFonts w:ascii="Arial" w:hAnsi="Arial"/>
+                <w:b w:val="0"/>
+                <w:color w:val="000000"/>
+                <w:sz w:val="18"/>
+              </w:rPr>
+              <w:t>P9</w:t>
+            </w:r>
+          </w:p>
+        </w:tc>
+        <w:tc>
+          <w:tcPr>
+            <w:tcW w:type="dxa" w:w="3744"/>
+            <w:shd w:val="clear" w:fill="FFFFFF"/>
+            <w:tcMar>
+              <w:top w:w="75" w:type="dxa"/>
+              <w:left w:w="75" w:type="dxa"/>
+              <w:bottom w:w="75" w:type="dxa"/>
+              <w:right w:w="75" w:type="dxa"/>
+            </w:tcMar>
+            <w:vAlign w:val="center"/>
+          </w:tcPr>
+          <w:p>
+            <w:pPr>
+              <w:keepNext w:val="0"/>
+              <w:spacing w:after="0" w:line="250" w:lineRule="auto"/>
+            </w:pPr>
+            <w:r>
+              <w:rPr>
+                <w:rFonts w:ascii="Arial" w:hAnsi="Arial"/>
+                <w:b w:val="0"/>
+                <w:color w:val="000000"/>
+                <w:sz w:val="18"/>
+              </w:rPr>
+              <w:t>P0 P1 P2 P3 P4 P5 P6 P7 P8 P9 P12 P13</w:t>
+            </w:r>
+          </w:p>
+        </w:tc>
+        <w:tc>
+          <w:tcPr>
+            <w:tcW w:type="dxa" w:w="6336"/>
+            <w:shd w:val="clear" w:fill="FFFFFF"/>
+            <w:tcMar>
+              <w:top w:w="75" w:type="dxa"/>
+              <w:left w:w="75" w:type="dxa"/>
+              <w:bottom w:w="75" w:type="dxa"/>
+              <w:right w:w="75" w:type="dxa"/>
+            </w:tcMar>
+            <w:vAlign w:val="center"/>
+          </w:tcPr>
+          <w:p>
+            <w:pPr>
+              <w:keepNext w:val="0"/>
+              <w:spacing w:after="0" w:line="250" w:lineRule="auto"/>
+            </w:pPr>
+            <w:r>
+              <w:rPr>
+                <w:rFonts w:ascii="Arial" w:hAnsi="Arial"/>
+                <w:b w:val="0"/>
+                <w:color w:val="000000"/>
+                <w:sz w:val="18"/>
+              </w:rPr>
+              <w:t>Regions ["South"]. INVALID_INPUT: choose at least one supported region.</w:t>
+            </w:r>
+          </w:p>
+        </w:tc>
+        <w:tc>
+          <w:tcPr>
+            <w:tcW w:type="dxa" w:w="4219"/>
+            <w:shd w:val="clear" w:fill="FFFFFF"/>
+            <w:tcMar>
+              <w:top w:w="75" w:type="dxa"/>
+              <w:left w:w="75" w:type="dxa"/>
+              <w:bottom w:w="75" w:type="dxa"/>
+              <w:right w:w="75" w:type="dxa"/>
+            </w:tcMar>
+            <w:vAlign w:val="center"/>
+          </w:tcPr>
+          <w:p>
+            <w:pPr>
+              <w:keepNext w:val="0"/>
+              <w:spacing w:after="0" w:line="250" w:lineRule="auto"/>
+            </w:pPr>
+            <w:r>
+              <w:rPr>
+                <w:rFonts w:ascii="Arial" w:hAnsi="Arial"/>
+                <w:b w:val="0"/>
+                <w:color w:val="000000"/>
+                <w:sz w:val="18"/>
+              </w:rPr>
+              <w:t>Pass; WB-P9 actual equals expected.</w:t>
+            </w:r>
+          </w:p>
+        </w:tc>
+      </w:tr>
+      <w:tr>
+        <w:trPr>
+          <w:cantSplit/>
+        </w:trPr>
+        <w:tc>
+          <w:tcPr>
+            <w:tcW w:type="dxa" w:w="792"/>
+            <w:shd w:val="clear" w:fill="FFFFFF"/>
+            <w:tcMar>
+              <w:top w:w="75" w:type="dxa"/>
+              <w:left w:w="75" w:type="dxa"/>
+              <w:bottom w:w="75" w:type="dxa"/>
+              <w:right w:w="75" w:type="dxa"/>
+            </w:tcMar>
+            <w:vAlign w:val="center"/>
+          </w:tcPr>
+          <w:p>
+            <w:pPr>
+              <w:keepNext w:val="0"/>
+              <w:spacing w:after="0" w:line="250" w:lineRule="auto"/>
+              <w:jc w:val="center"/>
+            </w:pPr>
+            <w:r>
+              <w:rPr>
+                <w:rFonts w:ascii="Arial" w:hAnsi="Arial"/>
+                <w:b w:val="0"/>
+                <w:color w:val="000000"/>
+                <w:sz w:val="18"/>
+              </w:rPr>
+              <w:t>P10</w:t>
+            </w:r>
+          </w:p>
+        </w:tc>
+        <w:tc>
+          <w:tcPr>
+            <w:tcW w:type="dxa" w:w="3744"/>
+            <w:shd w:val="clear" w:fill="FFFFFF"/>
+            <w:tcMar>
+              <w:top w:w="75" w:type="dxa"/>
+              <w:left w:w="75" w:type="dxa"/>
+              <w:bottom w:w="75" w:type="dxa"/>
+              <w:right w:w="75" w:type="dxa"/>
+            </w:tcMar>
+            <w:vAlign w:val="center"/>
+          </w:tcPr>
+          <w:p>
+            <w:pPr>
+              <w:keepNext w:val="0"/>
+              <w:spacing w:after="0" w:line="250" w:lineRule="auto"/>
+            </w:pPr>
+            <w:r>
+              <w:rPr>
+                <w:rFonts w:ascii="Arial" w:hAnsi="Arial"/>
+                <w:b w:val="0"/>
+                <w:color w:val="000000"/>
+                <w:sz w:val="18"/>
+              </w:rPr>
+              <w:t>P0 P1 P2 P3 P4 P5 P6 P7 P8 P9 P10 P13</w:t>
+            </w:r>
+          </w:p>
+        </w:tc>
+        <w:tc>
+          <w:tcPr>
+            <w:tcW w:type="dxa" w:w="6336"/>
+            <w:shd w:val="clear" w:fill="FFFFFF"/>
+            <w:tcMar>
+              <w:top w:w="75" w:type="dxa"/>
+              <w:left w:w="75" w:type="dxa"/>
+              <w:bottom w:w="75" w:type="dxa"/>
+              <w:right w:w="75" w:type="dxa"/>
+            </w:tcMar>
+            <w:vAlign w:val="center"/>
+          </w:tcPr>
+          <w:p>
+            <w:pPr>
+              <w:keepNext w:val="0"/>
+              <w:spacing w:after="0" w:line="250" w:lineRule="auto"/>
+            </w:pPr>
+            <w:r>
+              <w:rPr>
+                <w:rFonts w:ascii="Arial" w:hAnsi="Arial"/>
+                <w:b w:val="0"/>
+                <w:color w:val="000000"/>
+                <w:sz w:val="18"/>
+              </w:rPr>
+              <w:t>"  Alex Tan  "; Tennis, Tennis, Futsal; West. Returns "Alex Tan"; Tennis, Futsal; West.</w:t>
+            </w:r>
+          </w:p>
+        </w:tc>
+        <w:tc>
+          <w:tcPr>
+            <w:tcW w:type="dxa" w:w="4219"/>
+            <w:shd w:val="clear" w:fill="FFFFFF"/>
+            <w:tcMar>
+              <w:top w:w="75" w:type="dxa"/>
+              <w:left w:w="75" w:type="dxa"/>
+              <w:bottom w:w="75" w:type="dxa"/>
+              <w:right w:w="75" w:type="dxa"/>
+            </w:tcMar>
+            <w:vAlign w:val="center"/>
+          </w:tcPr>
+          <w:p>
+            <w:pPr>
+              <w:keepNext w:val="0"/>
+              <w:spacing w:after="0" w:line="250" w:lineRule="auto"/>
+            </w:pPr>
+            <w:r>
+              <w:rPr>
+                <w:rFonts w:ascii="Arial" w:hAnsi="Arial"/>
+                <w:b w:val="0"/>
+                <w:color w:val="000000"/>
+                <w:sz w:val="18"/>
+              </w:rPr>
+              <w:t>Pass; WB-P10 actual equals expected.</w:t>
+            </w:r>
+          </w:p>
+        </w:tc>
+      </w:tr>
+    </w:tbl>
+    <w:p>
+      <w:pPr>
+        <w:spacing w:after="20"/>
+      </w:pPr>
+    </w:p>
+    <w:p>
+      <w:r>
+        <w:rPr>
+          <w:b w:val="0"/>
+          <w:sz w:val="18"/>
+        </w:rPr>
+        <w:t>Each path adds at least one edge the earlier paths did not use, and together the ten paths use all 22 edges.</w:t>
+      </w:r>
+    </w:p>
+    <w:p>
+      <w:r>
+        <w:rPr>
+          <w:b w:val="0"/>
+          <w:sz w:val="18"/>
+        </w:rPr>
+        <w:t>The black-box UpdateProfile table tests the same rules from the outside; these paths show every decision in the code is reached.</w:t>
+      </w:r>
+    </w:p>
+    <w:p>
+      <w:r>
+        <w:rPr>
+          <w:b w:val="0"/>
+          <w:sz w:val="18"/>
+        </w:rPr>
+        <w:t>Evidence: tests/lab4/auth-profile-basis-path.test.ts (describe "prepareProfileUpdate") and evidence/auth-profile-basis-path-observations.json.</w:t>
+      </w:r>
+    </w:p>
+    <w:p>
+      <w:r>
+        <w:br w:type="page"/>
+      </w:r>
+    </w:p>
+    <w:p>
+      <w:pPr>
+        <w:pStyle w:val="Heading1"/>
+      </w:pPr>
+      <w:r>
         <w:t>White box testing UC1-04</w:t>
       </w:r>
     </w:p>
@@ -17396,7 +21192,7 @@
         <w:drawing>
           <wp:inline xmlns:a="http://schemas.openxmlformats.org/drawingml/2006/main" xmlns:pic="http://schemas.openxmlformats.org/drawingml/2006/picture">
             <wp:extent cx="9235440" cy="1714833"/>
-            <wp:docPr id="1" name="Picture 1" descr="delete account cfg control flow graph"/>
+            <wp:docPr id="4" name="Picture 4" descr="delete account cfg control flow graph"/>
             <wp:cNvGraphicFramePr>
               <a:graphicFrameLocks noChangeAspect="1"/>
             </wp:cNvGraphicFramePr>
@@ -17408,7 +21204,7 @@
                     <pic:cNvPicPr/>
                   </pic:nvPicPr>
                   <pic:blipFill>
-                    <a:blip r:embed="rId10"/>
+                    <a:blip r:embed="rId13"/>
                     <a:stretch>
                       <a:fillRect/>
                     </a:stretch>
@@ -18268,7 +22064,7 @@
         <w:drawing>
           <wp:inline xmlns:a="http://schemas.openxmlformats.org/drawingml/2006/main" xmlns:pic="http://schemas.openxmlformats.org/drawingml/2006/picture">
             <wp:extent cx="9235440" cy="1709656"/>
-            <wp:docPr id="2" name="Picture 2" descr="group join cfg control flow graph"/>
+            <wp:docPr id="5" name="Picture 5" descr="group join cfg control flow graph"/>
             <wp:cNvGraphicFramePr>
               <a:graphicFrameLocks noChangeAspect="1"/>
             </wp:cNvGraphicFramePr>
@@ -18280,7 +22076,7 @@
                     <pic:cNvPicPr/>
                   </pic:nvPicPr>
                   <pic:blipFill>
-                    <a:blip r:embed="rId11"/>
+                    <a:blip r:embed="rId14"/>
                     <a:stretch>
                       <a:fillRect/>
                     </a:stretch>
@@ -19112,7 +22908,7 @@
           <w:b w:val="0"/>
           <w:sz w:val="20"/>
         </w:rPr>
-        <w:t>All 201 focused checks passed; 2 are recorded as todo and none failed or were skipped. Execution used Node 22.22.2 and Vitest 4.1.11 on 20 October 2026 (20261020T082123Z UTC). The report reuses the recorded outputs; no manual browser result is inferred from those checks.</w:t>
+        <w:t>All 226 focused checks passed; 2 are recorded as todo and none failed or were skipped. Execution used Node 22.22.2 and Vitest 4.1.11 on 20 October 2026 (20261020T121849Z UTC). The report reuses the recorded outputs; no manual browser result is inferred from those checks.</w:t>
       </w:r>
     </w:p>
     <w:tbl>
@@ -19347,7 +23143,7 @@
                 <w:color w:val="000000"/>
                 <w:sz w:val="18"/>
               </w:rPr>
-              <w:t>tests/lab4/delete-account-black-box.test.ts</w:t>
+              <w:t>tests/lab4/auth-profile-basis-path.test.ts</w:t>
             </w:r>
           </w:p>
         </w:tc>
@@ -19376,7 +23172,7 @@
                 <w:color w:val="000000"/>
                 <w:sz w:val="18"/>
               </w:rPr>
-              <w:t>21</w:t>
+              <w:t>25</w:t>
             </w:r>
           </w:p>
         </w:tc>
@@ -19404,7 +23200,7 @@
                 <w:color w:val="000000"/>
                 <w:sz w:val="18"/>
               </w:rPr>
-              <w:t>Lab 4 UC1-04 equivalence classes and boundary values</w:t>
+              <w:t>Lab 4 basis paths: registerUser, safeRedirectPath, prepareProfileUpdate</w:t>
             </w:r>
           </w:p>
         </w:tc>
@@ -19438,7 +23234,7 @@
                 <w:color w:val="000000"/>
                 <w:sz w:val="18"/>
               </w:rPr>
-              <w:t>tests/lab4/update-profile-black-box.test.ts</w:t>
+              <w:t>tests/lab4/delete-account-black-box.test.ts</w:t>
             </w:r>
           </w:p>
         </w:tc>
@@ -19467,7 +23263,7 @@
                 <w:color w:val="000000"/>
                 <w:sz w:val="18"/>
               </w:rPr>
-              <w:t>19</w:t>
+              <w:t>21</w:t>
             </w:r>
           </w:p>
         </w:tc>
@@ -19495,7 +23291,7 @@
                 <w:color w:val="000000"/>
                 <w:sz w:val="18"/>
               </w:rPr>
-              <w:t>Lab 4 UC1-03 equivalence classes and boundary values</w:t>
+              <w:t>Lab 4 UC1-04 equivalence classes and boundary values</w:t>
             </w:r>
           </w:p>
         </w:tc>
@@ -19529,7 +23325,7 @@
                 <w:color w:val="000000"/>
                 <w:sz w:val="18"/>
               </w:rPr>
-              <w:t>tests/use-cases/UC1-01-register-user.test.ts</w:t>
+              <w:t>tests/lab4/update-profile-black-box.test.ts</w:t>
             </w:r>
           </w:p>
         </w:tc>
@@ -19558,7 +23354,7 @@
                 <w:color w:val="000000"/>
                 <w:sz w:val="18"/>
               </w:rPr>
-              <w:t>16</w:t>
+              <w:t>19</w:t>
             </w:r>
           </w:p>
         </w:tc>
@@ -19586,7 +23382,7 @@
                 <w:color w:val="000000"/>
                 <w:sz w:val="18"/>
               </w:rPr>
-              <w:t>Registration form, sign-up action and outcomes</w:t>
+              <w:t>Lab 4 UC1-03 equivalence classes and boundary values</w:t>
             </w:r>
           </w:p>
         </w:tc>
@@ -19620,7 +23416,7 @@
                 <w:color w:val="000000"/>
                 <w:sz w:val="18"/>
               </w:rPr>
-              <w:t>tests/use-cases/UC1-02-authenticate-user.test.ts</w:t>
+              <w:t>tests/use-cases/UC1-01-register-user.test.ts</w:t>
             </w:r>
           </w:p>
         </w:tc>
@@ -19649,7 +23445,7 @@
                 <w:color w:val="000000"/>
                 <w:sz w:val="18"/>
               </w:rPr>
-              <w:t>53</w:t>
+              <w:t>16</w:t>
             </w:r>
           </w:p>
         </w:tc>
@@ -19677,7 +23473,7 @@
                 <w:color w:val="000000"/>
                 <w:sz w:val="18"/>
               </w:rPr>
-              <w:t>Login, middleware protection, safe redirects</w:t>
+              <w:t>Registration form, sign-up action and outcomes</w:t>
             </w:r>
           </w:p>
         </w:tc>
@@ -19711,7 +23507,7 @@
                 <w:color w:val="000000"/>
                 <w:sz w:val="18"/>
               </w:rPr>
-              <w:t>tests/use-cases/UC1-03-manage-profile.test.ts</w:t>
+              <w:t>tests/use-cases/UC1-02-authenticate-user.test.ts</w:t>
             </w:r>
           </w:p>
         </w:tc>
@@ -19740,7 +23536,7 @@
                 <w:color w:val="000000"/>
                 <w:sz w:val="18"/>
               </w:rPr>
-              <w:t>14 (+1 todo)</w:t>
+              <w:t>53</w:t>
             </w:r>
           </w:p>
         </w:tc>
@@ -19768,7 +23564,7 @@
                 <w:color w:val="000000"/>
                 <w:sz w:val="18"/>
               </w:rPr>
-              <w:t>Profile policy and saving</w:t>
+              <w:t>Login, middleware protection, safe redirects</w:t>
             </w:r>
           </w:p>
         </w:tc>
@@ -19802,7 +23598,7 @@
                 <w:color w:val="000000"/>
                 <w:sz w:val="18"/>
               </w:rPr>
-              <w:t>tests/use-cases/UC1-04-delete-account.test.ts</w:t>
+              <w:t>tests/use-cases/UC1-03-manage-profile.test.ts</w:t>
             </w:r>
           </w:p>
         </w:tc>
@@ -19831,7 +23627,7 @@
                 <w:color w:val="000000"/>
                 <w:sz w:val="18"/>
               </w:rPr>
-              <w:t>15 (+1 todo)</w:t>
+              <w:t>14 (+1 todo)</w:t>
             </w:r>
           </w:p>
         </w:tc>
@@ -19859,7 +23655,7 @@
                 <w:color w:val="000000"/>
                 <w:sz w:val="18"/>
               </w:rPr>
-              <w:t>Deletion order, undo and blockers</w:t>
+              <w:t>Profile policy and saving</w:t>
             </w:r>
           </w:p>
         </w:tc>
@@ -19893,7 +23689,7 @@
                 <w:color w:val="000000"/>
                 <w:sz w:val="18"/>
               </w:rPr>
-              <w:t>tests/use-cases/UC1-06-manage-group.test.ts</w:t>
+              <w:t>tests/use-cases/UC1-04-delete-account.test.ts</w:t>
             </w:r>
           </w:p>
         </w:tc>
@@ -19922,7 +23718,7 @@
                 <w:color w:val="000000"/>
                 <w:sz w:val="18"/>
               </w:rPr>
-              <w:t>18</w:t>
+              <w:t>15 (+1 todo)</w:t>
             </w:r>
           </w:p>
         </w:tc>
@@ -19950,7 +23746,7 @@
                 <w:color w:val="000000"/>
                 <w:sz w:val="18"/>
               </w:rPr>
-              <w:t>Group create, join, members, links and archive</w:t>
+              <w:t>Deletion order, undo and blockers</w:t>
             </w:r>
           </w:p>
         </w:tc>
@@ -19984,7 +23780,7 @@
                 <w:color w:val="000000"/>
                 <w:sz w:val="18"/>
               </w:rPr>
-              <w:t>tests/app/profile/actions.test.ts</w:t>
+              <w:t>tests/use-cases/UC1-06-manage-group.test.ts</w:t>
             </w:r>
           </w:p>
         </w:tc>
@@ -20013,7 +23809,7 @@
                 <w:color w:val="000000"/>
                 <w:sz w:val="18"/>
               </w:rPr>
-              <w:t>2</w:t>
+              <w:t>18</w:t>
             </w:r>
           </w:p>
         </w:tc>
@@ -20041,7 +23837,7 @@
                 <w:color w:val="000000"/>
                 <w:sz w:val="18"/>
               </w:rPr>
-              <w:t>Profile server action</w:t>
+              <w:t>Group create, join, members, links and archive</w:t>
             </w:r>
           </w:p>
         </w:tc>
@@ -20075,7 +23871,7 @@
                 <w:color w:val="000000"/>
                 <w:sz w:val="18"/>
               </w:rPr>
-              <w:t>tests/app/profile/settings-links.test.ts</w:t>
+              <w:t>tests/app/profile/actions.test.ts</w:t>
             </w:r>
           </w:p>
         </w:tc>
@@ -20132,7 +23928,7 @@
                 <w:color w:val="000000"/>
                 <w:sz w:val="18"/>
               </w:rPr>
-              <w:t>Settings and Help links</w:t>
+              <w:t>Profile server action</w:t>
             </w:r>
           </w:p>
         </w:tc>
@@ -20166,7 +23962,7 @@
                 <w:color w:val="000000"/>
                 <w:sz w:val="18"/>
               </w:rPr>
-              <w:t>tests/domain/accounts/deactivation-policy.test.ts</w:t>
+              <w:t>tests/app/profile/settings-links.test.ts</w:t>
             </w:r>
           </w:p>
         </w:tc>
@@ -20195,7 +23991,7 @@
                 <w:color w:val="000000"/>
                 <w:sz w:val="18"/>
               </w:rPr>
-              <w:t>5</w:t>
+              <w:t>2</w:t>
             </w:r>
           </w:p>
         </w:tc>
@@ -20223,7 +24019,7 @@
                 <w:color w:val="000000"/>
                 <w:sz w:val="18"/>
               </w:rPr>
-              <w:t>Obligation policy</w:t>
+              <w:t>Settings and Help links</w:t>
             </w:r>
           </w:p>
         </w:tc>
@@ -20257,7 +24053,7 @@
                 <w:color w:val="000000"/>
                 <w:sz w:val="18"/>
               </w:rPr>
-              <w:t>tests/domain/groups/regular-group.test.ts</w:t>
+              <w:t>tests/domain/accounts/deactivation-policy.test.ts</w:t>
             </w:r>
           </w:p>
         </w:tc>
@@ -20286,7 +24082,7 @@
                 <w:color w:val="000000"/>
                 <w:sz w:val="18"/>
               </w:rPr>
-              <w:t>26</w:t>
+              <w:t>5</w:t>
             </w:r>
           </w:p>
         </w:tc>
@@ -20314,7 +24110,7 @@
                 <w:color w:val="000000"/>
                 <w:sz w:val="18"/>
               </w:rPr>
-              <w:t>Group aggregate rules</w:t>
+              <w:t>Obligation policy</w:t>
             </w:r>
           </w:p>
         </w:tc>
@@ -20348,6 +24144,97 @@
                 <w:color w:val="000000"/>
                 <w:sz w:val="18"/>
               </w:rPr>
+              <w:t>tests/domain/groups/regular-group.test.ts</w:t>
+            </w:r>
+          </w:p>
+        </w:tc>
+        <w:tc>
+          <w:tcPr>
+            <w:tcW w:type="dxa" w:w="1728"/>
+            <w:shd w:val="clear" w:fill="FFFFFF"/>
+            <w:tcMar>
+              <w:top w:w="75" w:type="dxa"/>
+              <w:left w:w="75" w:type="dxa"/>
+              <w:bottom w:w="75" w:type="dxa"/>
+              <w:right w:w="75" w:type="dxa"/>
+            </w:tcMar>
+            <w:vAlign w:val="center"/>
+          </w:tcPr>
+          <w:p>
+            <w:pPr>
+              <w:keepNext w:val="0"/>
+              <w:spacing w:after="0" w:line="250" w:lineRule="auto"/>
+              <w:jc w:val="center"/>
+            </w:pPr>
+            <w:r>
+              <w:rPr>
+                <w:rFonts w:ascii="Arial" w:hAnsi="Arial"/>
+                <w:b w:val="0"/>
+                <w:color w:val="000000"/>
+                <w:sz w:val="18"/>
+              </w:rPr>
+              <w:t>26</w:t>
+            </w:r>
+          </w:p>
+        </w:tc>
+        <w:tc>
+          <w:tcPr>
+            <w:tcW w:type="dxa" w:w="7171"/>
+            <w:shd w:val="clear" w:fill="FFFFFF"/>
+            <w:tcMar>
+              <w:top w:w="75" w:type="dxa"/>
+              <w:left w:w="75" w:type="dxa"/>
+              <w:bottom w:w="75" w:type="dxa"/>
+              <w:right w:w="75" w:type="dxa"/>
+            </w:tcMar>
+            <w:vAlign w:val="center"/>
+          </w:tcPr>
+          <w:p>
+            <w:pPr>
+              <w:keepNext w:val="0"/>
+              <w:spacing w:after="0" w:line="250" w:lineRule="auto"/>
+            </w:pPr>
+            <w:r>
+              <w:rPr>
+                <w:rFonts w:ascii="Arial" w:hAnsi="Arial"/>
+                <w:b w:val="0"/>
+                <w:color w:val="000000"/>
+                <w:sz w:val="18"/>
+              </w:rPr>
+              <w:t>Group aggregate rules</w:t>
+            </w:r>
+          </w:p>
+        </w:tc>
+      </w:tr>
+      <w:tr>
+        <w:trPr>
+          <w:cantSplit/>
+        </w:trPr>
+        <w:tc>
+          <w:tcPr>
+            <w:tcW w:type="dxa" w:w="6192"/>
+            <w:shd w:val="clear" w:fill="FFFFFF"/>
+            <w:tcMar>
+              <w:top w:w="75" w:type="dxa"/>
+              <w:left w:w="75" w:type="dxa"/>
+              <w:bottom w:w="75" w:type="dxa"/>
+              <w:right w:w="75" w:type="dxa"/>
+            </w:tcMar>
+            <w:vAlign w:val="center"/>
+          </w:tcPr>
+          <w:p>
+            <w:pPr>
+              <w:keepNext w:val="0"/>
+              <w:spacing w:after="0" w:line="250" w:lineRule="auto"/>
+              <w:jc w:val="center"/>
+            </w:pPr>
+            <w:r>
+              <w:rPr>
+                <w:rFonts w:ascii="Arial" w:hAnsi="Arial"/>
+                <w:b w:val="0"/>
+                <w:color w:val="000000"/>
+                <w:sz w:val="18"/>
+              </w:rPr>
               <w:t>Total</w:t>
             </w:r>
           </w:p>
@@ -20377,7 +24264,7 @@
                 <w:color w:val="000000"/>
                 <w:sz w:val="18"/>
               </w:rPr>
-              <w:t>201 (+2 todo)</w:t>
+              <w:t>226 (+2 todo)</w:t>
             </w:r>
           </w:p>
         </w:tc>
@@ -20405,7 +24292,7 @@
                 <w:color w:val="000000"/>
                 <w:sz w:val="18"/>
               </w:rPr>
-              <w:t>12 files; in-memory and mocked ports only</w:t>
+              <w:t>13 files; in-memory and mocked ports only</w:t>
             </w:r>
           </w:p>
         </w:tc>
@@ -20422,7 +24309,7 @@
           <w:b w:val="0"/>
           <w:sz w:val="18"/>
         </w:rPr>
-        <w:t>Recorded todos: UC1-03 Manage Profile computes and displays the reliability score; UC1-04 Delete Account retains the anonymised record for audit. The first matches a known gap: Settings calculates the reliability score from an empty history.</w:t>
+        <w:t>Recorded todos: UC1-03 Manage Profile computes and displays the reliability score; UC1-04 Delete Account retains the anonymised record for audit. The first matches a known gap at this baseline: Settings calculates the reliability score from an empty history (fix proposed in PR #101).</w:t>
       </w:r>
     </w:p>
     <w:p>

</xml_diff>